<commit_message>
Updated to V4.2 at (16/7/2026)
</commit_message>
<xml_diff>
--- a/info galore.docx
+++ b/info galore.docx
@@ -147,7 +147,15 @@
         <w:t>late-night</w:t>
       </w:r>
       <w:r>
-        <w:t xml:space="preserve"> call with a friend, I had discussed making an ai for myself, of course I was not too serious until I said “Hang on, why don’t </w:t>
+        <w:t xml:space="preserve"> call with a friend, I had discussed making an ai for myself, of course I was not too serious until I </w:t>
+      </w:r>
+      <w:proofErr w:type="gramStart"/>
+      <w:r>
+        <w:t>said</w:t>
+      </w:r>
+      <w:proofErr w:type="gramEnd"/>
+      <w:r>
+        <w:t xml:space="preserve"> “Hang on, why don’t </w:t>
       </w:r>
       <w:r>
         <w:t>I</w:t>
@@ -156,10 +164,12 @@
         <w:t xml:space="preserve">?” </w:t>
       </w:r>
       <w:proofErr w:type="spellStart"/>
+      <w:proofErr w:type="gramStart"/>
       <w:r>
         <w:t>Annnddddd</w:t>
       </w:r>
       <w:proofErr w:type="spellEnd"/>
+      <w:proofErr w:type="gramEnd"/>
       <w:r>
         <w:t xml:space="preserve"> it started a VERY LONG chain of events that led to this :D</w:t>
       </w:r>
@@ -183,7 +193,15 @@
         <w:t>However,</w:t>
       </w:r>
       <w:r>
-        <w:t xml:space="preserve"> I thought it was the architecture that was the problem </w:t>
+        <w:t xml:space="preserve"> I thought it was the architecture that was the </w:t>
+      </w:r>
+      <w:proofErr w:type="gramStart"/>
+      <w:r>
+        <w:t>problem</w:t>
+      </w:r>
+      <w:proofErr w:type="gramEnd"/>
+      <w:r>
+        <w:t xml:space="preserve"> </w:t>
       </w:r>
       <w:r>
         <w:t xml:space="preserve">so I switched to transformers. The issue with that was the exponential training times. I made a 19M model (back when I had no idea how things worked) and tried making it function like a chatbot called sky (after sky-net from terminator) however it did not work because obviously it was WAY </w:t>
@@ -205,7 +223,23 @@
       </w:r>
       <w:proofErr w:type="spellEnd"/>
       <w:r>
-        <w:t xml:space="preserve"> increased (Like 20 years for training on a business laptop CPU) so I was discouraged. I had to compromise and run pretrained models and that worked like a charm! However it got boring and repetitive so I made </w:t>
+        <w:t xml:space="preserve"> increased (Like 20 years for training on a business laptop CPU) so I was discouraged. I had to compromise and run pretrained models and that worked like a charm! </w:t>
+      </w:r>
+      <w:proofErr w:type="gramStart"/>
+      <w:r>
+        <w:t>However</w:t>
+      </w:r>
+      <w:proofErr w:type="gramEnd"/>
+      <w:r>
+        <w:t xml:space="preserve"> it got boring and </w:t>
+      </w:r>
+      <w:proofErr w:type="gramStart"/>
+      <w:r>
+        <w:t>repetitive</w:t>
+      </w:r>
+      <w:proofErr w:type="gramEnd"/>
+      <w:r>
+        <w:t xml:space="preserve"> so I made </w:t>
       </w:r>
       <w:proofErr w:type="spellStart"/>
       <w:r>
@@ -235,7 +269,15 @@
     </w:p>
     <w:p>
       <w:r>
-        <w:t>After some thinking I thought “Hang on, how come brains have 86B neurons and only run on 20W of power?” After some research I found out about sparse computing. Only neurons that were required were actually used! Some thinking and whiteboarding later I had a concept and was ready to start building</w:t>
+        <w:t xml:space="preserve">After some thinking I thought “Hang on, how come brains have 86B neurons and only run on 20W of power?” After some research I found out about sparse computing. Only neurons that were required were </w:t>
+      </w:r>
+      <w:proofErr w:type="gramStart"/>
+      <w:r>
+        <w:t>actually used</w:t>
+      </w:r>
+      <w:proofErr w:type="gramEnd"/>
+      <w:r>
+        <w:t>! Some thinking and whiteboarding later I had a concept and was ready to start building</w:t>
       </w:r>
     </w:p>
     <w:p>
@@ -252,8 +294,13 @@
       </w:r>
     </w:p>
     <w:p>
-      <w:r>
-        <w:t xml:space="preserve">So the very first version was trying to get as biologically accurate as possible. Using thresholds and </w:t>
+      <w:proofErr w:type="gramStart"/>
+      <w:r>
+        <w:t>So</w:t>
+      </w:r>
+      <w:proofErr w:type="gramEnd"/>
+      <w:r>
+        <w:t xml:space="preserve"> the very first version was trying to get as biologically accurate as possible. Using thresholds and </w:t>
       </w:r>
       <w:r>
         <w:t xml:space="preserve">connection lists and Hebbian learning etc </w:t>
@@ -264,19 +311,53 @@
       </w:r>
       <w:proofErr w:type="spellEnd"/>
       <w:r>
-        <w:t xml:space="preserve">. When building it I encountered issues though. It required EXTREMELY delicate tuning that would work for about one step. If it was slightly too high then it would have a seizure where everything is active however if it was too low then nothing would activate and no thinking would happen. After adding supports like variable adjustors for each stat and working thru errors it was eventually marked as a failure. All the extra lists and stats build up memory and it was </w:t>
-      </w:r>
-      <w:r>
-        <w:t>unscalable. Basically there was too m</w:t>
-      </w:r>
-      <w:r>
-        <w:t xml:space="preserve">uch features and </w:t>
-      </w:r>
-      <w:proofErr w:type="spellStart"/>
+        <w:t xml:space="preserve">. When building it I encountered issues though. It required EXTREMELY delicate tuning that would work for about one step. If it was slightly too </w:t>
+      </w:r>
+      <w:proofErr w:type="gramStart"/>
+      <w:r>
+        <w:t>high</w:t>
+      </w:r>
+      <w:proofErr w:type="gramEnd"/>
+      <w:r>
+        <w:t xml:space="preserve"> then it would have a seizure where everything is active however if it was too low then nothing would activate and no thinking would happen. After adding supports like variable adjustors for each stat and working thru errors it was eventually marked as a failure. All the extra lists and stats build up </w:t>
+      </w:r>
+      <w:proofErr w:type="gramStart"/>
+      <w:r>
+        <w:t>memory</w:t>
+      </w:r>
+      <w:proofErr w:type="gramEnd"/>
+      <w:r>
+        <w:t xml:space="preserve"> and it was </w:t>
+      </w:r>
+      <w:r>
+        <w:t xml:space="preserve">unscalable. </w:t>
+      </w:r>
+      <w:proofErr w:type="gramStart"/>
+      <w:r>
+        <w:t>Basically</w:t>
+      </w:r>
+      <w:proofErr w:type="gramEnd"/>
+      <w:r>
+        <w:t xml:space="preserve"> there was too </w:t>
+      </w:r>
+      <w:proofErr w:type="gramStart"/>
+      <w:r>
+        <w:t>m</w:t>
+      </w:r>
+      <w:r>
+        <w:t>uch</w:t>
+      </w:r>
+      <w:proofErr w:type="gramEnd"/>
+      <w:r>
+        <w:t xml:space="preserve"> features and </w:t>
+      </w:r>
+      <w:proofErr w:type="spellStart"/>
+      <w:proofErr w:type="gramStart"/>
       <w:r>
         <w:t>its</w:t>
       </w:r>
       <w:proofErr w:type="spellEnd"/>
+      <w:proofErr w:type="gramEnd"/>
       <w:r>
         <w:t xml:space="preserve"> impossible to balance them.</w:t>
       </w:r>
@@ -311,7 +392,23 @@
         <w:t xml:space="preserve"> 4 neurons into a single int8 which makes it very </w:t>
       </w:r>
       <w:r>
-        <w:t>compact (40B in 10gb). This system was also so simple that it didn’t need to carry signal strength or anything. However the issue with this one is that it used random mutation to change and it mutated correct ones. Credit assignment isn’t possible  so it couldn’t learn as well as the probability of getting or even finding a correct answer is infinitely small.</w:t>
+        <w:t xml:space="preserve">compact (40B in 10gb). This system was also so simple that it didn’t need to carry signal strength or anything. </w:t>
+      </w:r>
+      <w:proofErr w:type="gramStart"/>
+      <w:r>
+        <w:t>However</w:t>
+      </w:r>
+      <w:proofErr w:type="gramEnd"/>
+      <w:r>
+        <w:t xml:space="preserve"> the issue with this one is that it used random mutation to change and it mutated correct ones. Credit assignment isn’t </w:t>
+      </w:r>
+      <w:proofErr w:type="gramStart"/>
+      <w:r>
+        <w:t>possible  so</w:t>
+      </w:r>
+      <w:proofErr w:type="gramEnd"/>
+      <w:r>
+        <w:t xml:space="preserve"> it couldn’t learn as well as the probability of getting or even finding a correct answer is infinitely small.</w:t>
       </w:r>
     </w:p>
     <w:p>
@@ -323,8 +420,13 @@
       </w:r>
     </w:p>
     <w:p>
-      <w:r>
-        <w:t xml:space="preserve">So for this version I thought “If lines work what about curves? Those are </w:t>
+      <w:proofErr w:type="gramStart"/>
+      <w:r>
+        <w:t>So</w:t>
+      </w:r>
+      <w:proofErr w:type="gramEnd"/>
+      <w:r>
+        <w:t xml:space="preserve"> for this version I thought “If lines work what about curves? Those are </w:t>
       </w:r>
       <w:r>
         <w:t>gradient</w:t>
@@ -385,7 +487,15 @@
         <w:t xml:space="preserve"> it had no method for attention or any values other than starting X and ending X position making it very shallow. Secondly,</w:t>
       </w:r>
       <w:r>
-        <w:t xml:space="preserve"> precise adjustments are impossible since it has to be stored as an integer (I did +- 15) which really limits how precise it is. Signals also </w:t>
+        <w:t xml:space="preserve"> precise adjustments are impossible since it </w:t>
+      </w:r>
+      <w:proofErr w:type="gramStart"/>
+      <w:r>
+        <w:t>has to</w:t>
+      </w:r>
+      <w:proofErr w:type="gramEnd"/>
+      <w:r>
+        <w:t xml:space="preserve"> be stored as an integer (I did +- 15) which really limits how precise it is. Signals also </w:t>
       </w:r>
       <w:r>
         <w:t>can’t</w:t>
@@ -529,6 +639,833 @@
     <w:p>
       <w:r>
         <w:t>After some more testing I realised that a better form of attention is needed than the sum and averaging of previous token route answers, currently finding a form of functioning attention is still in progress</w:t>
+      </w:r>
+    </w:p>
+    <w:p>
+      <w:r>
+        <w:t>Project was reverted to the state of single token generation, as the newer versions have stacked on layers that do not help the system and make debugging harder.</w:t>
+      </w:r>
+    </w:p>
+    <w:p>
+      <w:r>
+        <w:lastRenderedPageBreak/>
+        <w:t xml:space="preserve">New ideas introduced. Re-adding and reworking the QKV idea but this time done right as previously it was done wrong where all 256 dims (testing number) was all the same because they all were multiplied the same, however this rework will increase the dimensions of the model itself by storing a 1D list of numbers for each dimension to avoid “The curse of dimensionality” as Llama does. This gives it a larger representational capacity without blowing up storage requirements. Actual backprop will (probably) be added if I get around to it. After it works (Or if it does) </w:t>
+      </w:r>
+      <w:proofErr w:type="spellStart"/>
+      <w:r>
+        <w:t>im</w:t>
+      </w:r>
+      <w:proofErr w:type="spellEnd"/>
+      <w:r>
+        <w:t xml:space="preserve"> going to start learning C++ so that I can optimize it to run fast </w:t>
+      </w:r>
+      <w:r>
+        <w:t>and the ideas of manually fetching cache will be quite beneficial due to its irregular access patterns + faster math</w:t>
+      </w:r>
+    </w:p>
+    <w:p>
+      <w:pPr>
+        <w:rPr>
+          <w:b/>
+          <w:bCs/>
+        </w:rPr>
+      </w:pPr>
+      <w:r>
+        <w:t>Checklist (</w:t>
+      </w:r>
+      <w:proofErr w:type="gramStart"/>
+      <w:r>
+        <w:t>Yes</w:t>
+      </w:r>
+      <w:proofErr w:type="gramEnd"/>
+      <w:r>
+        <w:t xml:space="preserve"> it was created by </w:t>
+      </w:r>
+      <w:proofErr w:type="spellStart"/>
+      <w:r>
+        <w:t>claude</w:t>
+      </w:r>
+      <w:proofErr w:type="spellEnd"/>
+      <w:r>
+        <w:t xml:space="preserve"> </w:t>
+      </w:r>
+      <w:proofErr w:type="spellStart"/>
+      <w:r>
+        <w:t>bcus</w:t>
+      </w:r>
+      <w:proofErr w:type="spellEnd"/>
+      <w:r>
+        <w:t xml:space="preserve"> </w:t>
+      </w:r>
+      <w:proofErr w:type="spellStart"/>
+      <w:r>
+        <w:t>im</w:t>
+      </w:r>
+      <w:proofErr w:type="spellEnd"/>
+      <w:r>
+        <w:t xml:space="preserve"> too lazy to do formatting and whatnot)</w:t>
+      </w:r>
+      <w:r>
+        <w:br/>
+      </w:r>
+      <w:r>
+        <w:rPr>
+          <w:b/>
+          <w:bCs/>
+        </w:rPr>
+        <w:t>1. Token embeddings (new data structure)</w:t>
+      </w:r>
+    </w:p>
+    <w:p>
+      <w:pPr>
+        <w:numPr>
+          <w:ilvl w:val="0"/>
+          <w:numId w:val="1"/>
+        </w:numPr>
+      </w:pPr>
+      <w:r>
+        <w:t xml:space="preserve">Add an </w:t>
+      </w:r>
+      <w:r>
+        <w:rPr>
+          <w:b/>
+          <w:bCs/>
+        </w:rPr>
+        <w:t>embedding table</w:t>
+      </w:r>
+      <w:r>
+        <w:t>: shape (</w:t>
+      </w:r>
+      <w:proofErr w:type="spellStart"/>
+      <w:r>
+        <w:t>vocab_size</w:t>
+      </w:r>
+      <w:proofErr w:type="spellEnd"/>
+      <w:r>
+        <w:t>, d), one row of d learnable floats per token. Small d (start with 8–16), random init.</w:t>
+      </w:r>
+    </w:p>
+    <w:p>
+      <w:pPr>
+        <w:numPr>
+          <w:ilvl w:val="0"/>
+          <w:numId w:val="1"/>
+        </w:numPr>
+      </w:pPr>
+      <w:r>
+        <w:t xml:space="preserve">Separate from </w:t>
+      </w:r>
+      <w:proofErr w:type="spellStart"/>
+      <w:r>
+        <w:t>i_vecs</w:t>
+      </w:r>
+      <w:proofErr w:type="spellEnd"/>
+      <w:r>
+        <w:t>/</w:t>
+      </w:r>
+      <w:proofErr w:type="spellStart"/>
+      <w:r>
+        <w:t>o_vecs</w:t>
+      </w:r>
+      <w:proofErr w:type="spellEnd"/>
+      <w:r>
+        <w:t xml:space="preserve"> (which stay spatial: token → grid position). Embedding table holds </w:t>
+      </w:r>
+      <w:r>
+        <w:rPr>
+          <w:i/>
+          <w:iCs/>
+        </w:rPr>
+        <w:t>content</w:t>
+      </w:r>
+      <w:r>
+        <w:t xml:space="preserve"> vectors, not positions.</w:t>
+      </w:r>
+    </w:p>
+    <w:p>
+      <w:pPr>
+        <w:numPr>
+          <w:ilvl w:val="0"/>
+          <w:numId w:val="1"/>
+        </w:numPr>
+      </w:pPr>
+      <w:r>
+        <w:t>Static/context-free — always the same values for a given token before contextualization.</w:t>
+      </w:r>
+    </w:p>
+    <w:p>
+      <w:pPr>
+        <w:rPr>
+          <w:b/>
+          <w:bCs/>
+        </w:rPr>
+      </w:pPr>
+      <w:r>
+        <w:rPr>
+          <w:b/>
+          <w:bCs/>
+        </w:rPr>
+        <w:t>2. QKV projections (new parameters)</w:t>
+      </w:r>
+    </w:p>
+    <w:p>
+      <w:pPr>
+        <w:numPr>
+          <w:ilvl w:val="0"/>
+          <w:numId w:val="2"/>
+        </w:numPr>
+      </w:pPr>
+      <w:r>
+        <w:t xml:space="preserve">Three small dense matrices: </w:t>
+      </w:r>
+      <w:proofErr w:type="spellStart"/>
+      <w:r>
+        <w:t>W_q</w:t>
+      </w:r>
+      <w:proofErr w:type="spellEnd"/>
+      <w:r>
+        <w:t xml:space="preserve">, </w:t>
+      </w:r>
+      <w:proofErr w:type="spellStart"/>
+      <w:r>
+        <w:t>W_k</w:t>
+      </w:r>
+      <w:proofErr w:type="spellEnd"/>
+      <w:r>
+        <w:t xml:space="preserve">, </w:t>
+      </w:r>
+      <w:proofErr w:type="spellStart"/>
+      <w:r>
+        <w:t>W_v</w:t>
+      </w:r>
+      <w:proofErr w:type="spellEnd"/>
+      <w:r>
+        <w:t xml:space="preserve">, each roughly </w:t>
+      </w:r>
+      <w:proofErr w:type="spellStart"/>
+      <w:r>
+        <w:t>d_k</w:t>
+      </w:r>
+      <w:proofErr w:type="spellEnd"/>
+      <w:r>
+        <w:t xml:space="preserve"> × d (or </w:t>
+      </w:r>
+      <w:proofErr w:type="spellStart"/>
+      <w:r>
+        <w:t>d_v</w:t>
+      </w:r>
+      <w:proofErr w:type="spellEnd"/>
+      <w:r>
+        <w:t xml:space="preserve"> × d for </w:t>
+      </w:r>
+      <w:proofErr w:type="spellStart"/>
+      <w:r>
+        <w:t>W_v</w:t>
+      </w:r>
+      <w:proofErr w:type="spellEnd"/>
+      <w:r>
+        <w:t>). Fixed size, independent of grid size — not part of the sparse grid at all.</w:t>
+      </w:r>
+    </w:p>
+    <w:p>
+      <w:pPr>
+        <w:numPr>
+          <w:ilvl w:val="0"/>
+          <w:numId w:val="2"/>
+        </w:numPr>
+      </w:pPr>
+      <w:r>
+        <w:t xml:space="preserve">Q = </w:t>
+      </w:r>
+      <w:proofErr w:type="spellStart"/>
+      <w:r>
+        <w:t>W_q</w:t>
+      </w:r>
+      <w:proofErr w:type="spellEnd"/>
+      <w:r>
+        <w:t xml:space="preserve"> @ </w:t>
+      </w:r>
+      <w:proofErr w:type="spellStart"/>
+      <w:r>
+        <w:t>current_state_vec</w:t>
+      </w:r>
+      <w:proofErr w:type="spellEnd"/>
+    </w:p>
+    <w:p>
+      <w:pPr>
+        <w:numPr>
+          <w:ilvl w:val="0"/>
+          <w:numId w:val="2"/>
+        </w:numPr>
+      </w:pPr>
+      <w:proofErr w:type="spellStart"/>
+      <w:r>
+        <w:t>K_i</w:t>
+      </w:r>
+      <w:proofErr w:type="spellEnd"/>
+      <w:r>
+        <w:t xml:space="preserve"> = </w:t>
+      </w:r>
+      <w:proofErr w:type="spellStart"/>
+      <w:r>
+        <w:t>W_k</w:t>
+      </w:r>
+      <w:proofErr w:type="spellEnd"/>
+      <w:r>
+        <w:t xml:space="preserve"> @ </w:t>
+      </w:r>
+      <w:proofErr w:type="spellStart"/>
+      <w:r>
+        <w:t>token_i_vec</w:t>
+      </w:r>
+      <w:proofErr w:type="spellEnd"/>
+      <w:r>
+        <w:t xml:space="preserve"> (for each context token)</w:t>
+      </w:r>
+    </w:p>
+    <w:p>
+      <w:pPr>
+        <w:numPr>
+          <w:ilvl w:val="0"/>
+          <w:numId w:val="2"/>
+        </w:numPr>
+      </w:pPr>
+      <w:proofErr w:type="spellStart"/>
+      <w:r>
+        <w:t>V_i</w:t>
+      </w:r>
+      <w:proofErr w:type="spellEnd"/>
+      <w:r>
+        <w:t xml:space="preserve"> = </w:t>
+      </w:r>
+      <w:proofErr w:type="spellStart"/>
+      <w:r>
+        <w:t>W_v</w:t>
+      </w:r>
+      <w:proofErr w:type="spellEnd"/>
+      <w:r>
+        <w:t xml:space="preserve"> @ </w:t>
+      </w:r>
+      <w:proofErr w:type="spellStart"/>
+      <w:r>
+        <w:t>token_i_vec</w:t>
+      </w:r>
+      <w:proofErr w:type="spellEnd"/>
+    </w:p>
+    <w:p>
+      <w:pPr>
+        <w:rPr>
+          <w:b/>
+          <w:bCs/>
+        </w:rPr>
+      </w:pPr>
+      <w:r>
+        <w:rPr>
+          <w:b/>
+          <w:bCs/>
+        </w:rPr>
+        <w:t>3. Content-dependent magnitude (relevance score)</w:t>
+      </w:r>
+    </w:p>
+    <w:p>
+      <w:pPr>
+        <w:numPr>
+          <w:ilvl w:val="0"/>
+          <w:numId w:val="3"/>
+        </w:numPr>
+      </w:pPr>
+      <w:proofErr w:type="spellStart"/>
+      <w:r>
+        <w:t>score_i</w:t>
+      </w:r>
+      <w:proofErr w:type="spellEnd"/>
+      <w:r>
+        <w:t xml:space="preserve"> = Q · </w:t>
+      </w:r>
+      <w:proofErr w:type="spellStart"/>
+      <w:r>
+        <w:t>K_i</w:t>
+      </w:r>
+      <w:proofErr w:type="spellEnd"/>
+      <w:r>
+        <w:t xml:space="preserve"> — replaces the fixed /2 blend ratio.</w:t>
+      </w:r>
+    </w:p>
+    <w:p>
+      <w:pPr>
+        <w:numPr>
+          <w:ilvl w:val="0"/>
+          <w:numId w:val="3"/>
+        </w:numPr>
+      </w:pPr>
+      <w:r>
+        <w:t xml:space="preserve">Because embeddings are vectors (not scalars), this dot product </w:t>
+      </w:r>
+      <w:proofErr w:type="gramStart"/>
+      <w:r>
+        <w:t>actually varies</w:t>
+      </w:r>
+      <w:proofErr w:type="gramEnd"/>
+      <w:r>
+        <w:t xml:space="preserve"> with content instead of collapsing to one number for everyone.</w:t>
+      </w:r>
+    </w:p>
+    <w:p>
+      <w:pPr>
+        <w:numPr>
+          <w:ilvl w:val="0"/>
+          <w:numId w:val="3"/>
+        </w:numPr>
+      </w:pPr>
+      <w:r>
+        <w:t>This is "how much does this context token matter right now."</w:t>
+      </w:r>
+    </w:p>
+    <w:p>
+      <w:pPr>
+        <w:rPr>
+          <w:b/>
+          <w:bCs/>
+        </w:rPr>
+      </w:pPr>
+      <w:r>
+        <w:rPr>
+          <w:b/>
+          <w:bCs/>
+        </w:rPr>
+        <w:t xml:space="preserve">4. Contextualized embeddings ("movable" embeddings — disambiguation, e.g. </w:t>
+      </w:r>
+      <w:proofErr w:type="gramStart"/>
+      <w:r>
+        <w:rPr>
+          <w:b/>
+          <w:bCs/>
+        </w:rPr>
+        <w:t>river bank</w:t>
+      </w:r>
+      <w:proofErr w:type="gramEnd"/>
+      <w:r>
+        <w:rPr>
+          <w:b/>
+          <w:bCs/>
+        </w:rPr>
+        <w:t xml:space="preserve"> vs. financial bank)</w:t>
+      </w:r>
+    </w:p>
+    <w:p>
+      <w:pPr>
+        <w:numPr>
+          <w:ilvl w:val="0"/>
+          <w:numId w:val="4"/>
+        </w:numPr>
+      </w:pPr>
+      <w:proofErr w:type="spellStart"/>
+      <w:r>
+        <w:t>effective_vec</w:t>
+      </w:r>
+      <w:proofErr w:type="spellEnd"/>
+      <w:r>
+        <w:t xml:space="preserve">(token) = </w:t>
+      </w:r>
+      <w:proofErr w:type="spellStart"/>
+      <w:r>
+        <w:t>weighted_sum_over_</w:t>
+      </w:r>
+      <w:proofErr w:type="gramStart"/>
+      <w:r>
+        <w:t>context</w:t>
+      </w:r>
+      <w:proofErr w:type="spellEnd"/>
+      <w:r>
+        <w:t>(</w:t>
+      </w:r>
+      <w:proofErr w:type="spellStart"/>
+      <w:proofErr w:type="gramEnd"/>
+      <w:r>
+        <w:t>V_i</w:t>
+      </w:r>
+      <w:proofErr w:type="spellEnd"/>
+      <w:r>
+        <w:t>, weight=</w:t>
+      </w:r>
+      <w:proofErr w:type="spellStart"/>
+      <w:r>
+        <w:t>score_i</w:t>
+      </w:r>
+      <w:proofErr w:type="spellEnd"/>
+      <w:r>
+        <w:t>)</w:t>
+      </w:r>
+    </w:p>
+    <w:p>
+      <w:pPr>
+        <w:numPr>
+          <w:ilvl w:val="0"/>
+          <w:numId w:val="4"/>
+        </w:numPr>
+      </w:pPr>
+      <w:r>
+        <w:lastRenderedPageBreak/>
+        <w:t>Static embedding never changes; this weighted blend is recomputed fresh every time the token appears, pulled toward whichever context tokens score as relevant.</w:t>
+      </w:r>
+    </w:p>
+    <w:p>
+      <w:pPr>
+        <w:numPr>
+          <w:ilvl w:val="0"/>
+          <w:numId w:val="4"/>
+        </w:numPr>
+      </w:pPr>
+      <w:r>
+        <w:t>This blended vector — not the raw static embedding — feeds into the rest of the walker step.</w:t>
+      </w:r>
+    </w:p>
+    <w:p>
+      <w:pPr>
+        <w:numPr>
+          <w:ilvl w:val="0"/>
+          <w:numId w:val="4"/>
+        </w:numPr>
+      </w:pPr>
+      <w:r>
+        <w:t xml:space="preserve">Cheaper alternative if full </w:t>
+      </w:r>
+      <w:proofErr w:type="gramStart"/>
+      <w:r>
+        <w:t>weighted-sum</w:t>
+      </w:r>
+      <w:proofErr w:type="gramEnd"/>
+      <w:r>
+        <w:t xml:space="preserve"> is too much: additive offset version, </w:t>
+      </w:r>
+      <w:proofErr w:type="spellStart"/>
+      <w:r>
+        <w:t>effective_vec</w:t>
+      </w:r>
+      <w:proofErr w:type="spellEnd"/>
+      <w:r>
+        <w:t xml:space="preserve"> = </w:t>
+      </w:r>
+      <w:proofErr w:type="spellStart"/>
+      <w:r>
+        <w:t>base_vec</w:t>
+      </w:r>
+      <w:proofErr w:type="spellEnd"/>
+      <w:r>
+        <w:t xml:space="preserve"> + f(context).</w:t>
+      </w:r>
+    </w:p>
+    <w:p>
+      <w:pPr>
+        <w:rPr>
+          <w:b/>
+          <w:bCs/>
+        </w:rPr>
+      </w:pPr>
+      <w:r>
+        <w:rPr>
+          <w:b/>
+          <w:bCs/>
+        </w:rPr>
+        <w:t>5. Content-dependent direction (novel — not standard attention)</w:t>
+      </w:r>
+    </w:p>
+    <w:p>
+      <w:pPr>
+        <w:numPr>
+          <w:ilvl w:val="0"/>
+          <w:numId w:val="5"/>
+        </w:numPr>
+      </w:pPr>
+      <w:r>
+        <w:t xml:space="preserve">Separate from magnitude/relevance. A second output of the context computation: something like an angle or 2D unit vector that steers </w:t>
+      </w:r>
+      <w:r>
+        <w:rPr>
+          <w:i/>
+          <w:iCs/>
+        </w:rPr>
+        <w:t>which way</w:t>
+      </w:r>
+      <w:r>
+        <w:t xml:space="preserve"> the walker moves next, not just how far.</w:t>
+      </w:r>
+    </w:p>
+    <w:p>
+      <w:pPr>
+        <w:numPr>
+          <w:ilvl w:val="0"/>
+          <w:numId w:val="5"/>
+        </w:numPr>
+      </w:pPr>
+      <w:r>
+        <w:t xml:space="preserve">Should likely be a function of </w:t>
+      </w:r>
+      <w:r>
+        <w:rPr>
+          <w:i/>
+          <w:iCs/>
+        </w:rPr>
+        <w:t>(current state, context)</w:t>
+      </w:r>
+      <w:r>
+        <w:t xml:space="preserve"> jointly, not context alone, so the walker retains its own dynamics rather than being purely reactive.</w:t>
+      </w:r>
+    </w:p>
+    <w:p>
+      <w:pPr>
+        <w:numPr>
+          <w:ilvl w:val="0"/>
+          <w:numId w:val="5"/>
+        </w:numPr>
+      </w:pPr>
+      <w:r>
+        <w:t>Needs its own projection/output, distinct from the magnitude score in point 3.</w:t>
+      </w:r>
+    </w:p>
+    <w:p>
+      <w:pPr>
+        <w:rPr>
+          <w:b/>
+          <w:bCs/>
+        </w:rPr>
+      </w:pPr>
+      <w:r>
+        <w:rPr>
+          <w:b/>
+          <w:bCs/>
+        </w:rPr>
+        <w:t>6. Differentiable grid read (required for backprop through the walk)</w:t>
+      </w:r>
+    </w:p>
+    <w:p>
+      <w:pPr>
+        <w:numPr>
+          <w:ilvl w:val="0"/>
+          <w:numId w:val="6"/>
+        </w:numPr>
+      </w:pPr>
+      <w:r>
+        <w:t>Hard integer indexing (</w:t>
+      </w:r>
+      <w:proofErr w:type="gramStart"/>
+      <w:r>
+        <w:t>grid[</w:t>
+      </w:r>
+      <w:proofErr w:type="gramEnd"/>
+      <w:r>
+        <w:t xml:space="preserve">row, col]) has no gradient. Needs </w:t>
+      </w:r>
+      <w:r>
+        <w:rPr>
+          <w:b/>
+          <w:bCs/>
+        </w:rPr>
+        <w:t>bilinear interpolation</w:t>
+      </w:r>
+      <w:r>
+        <w:t>: read as a weighted blend of the 4 nearest integer grid cells based on fractional walk position.</w:t>
+      </w:r>
+    </w:p>
+    <w:p>
+      <w:pPr>
+        <w:numPr>
+          <w:ilvl w:val="0"/>
+          <w:numId w:val="6"/>
+        </w:numPr>
+      </w:pPr>
+      <w:r>
+        <w:t>This is the foundation everything else sits on — implement and gradient-check (finite differences vs. analytic) in isolation first.</w:t>
+      </w:r>
+    </w:p>
+    <w:p>
+      <w:pPr>
+        <w:rPr>
+          <w:b/>
+          <w:bCs/>
+        </w:rPr>
+      </w:pPr>
+      <w:r>
+        <w:rPr>
+          <w:b/>
+          <w:bCs/>
+        </w:rPr>
+        <w:t>7. Backprop (manual, NumPy)</w:t>
+      </w:r>
+    </w:p>
+    <w:p>
+      <w:pPr>
+        <w:numPr>
+          <w:ilvl w:val="0"/>
+          <w:numId w:val="7"/>
+        </w:numPr>
+      </w:pPr>
+      <w:r>
+        <w:t xml:space="preserve">No </w:t>
+      </w:r>
+      <w:proofErr w:type="spellStart"/>
+      <w:r>
+        <w:t>autodiff</w:t>
+      </w:r>
+      <w:proofErr w:type="spellEnd"/>
+      <w:r>
+        <w:t xml:space="preserve"> — write paired forward/backward functions for each op (</w:t>
+      </w:r>
+      <w:proofErr w:type="spellStart"/>
+      <w:r>
+        <w:t>matmul</w:t>
+      </w:r>
+      <w:proofErr w:type="spellEnd"/>
+      <w:r>
+        <w:t>, dot product, interpolation, nonlinearities).</w:t>
+      </w:r>
+    </w:p>
+    <w:p>
+      <w:pPr>
+        <w:numPr>
+          <w:ilvl w:val="0"/>
+          <w:numId w:val="7"/>
+        </w:numPr>
+      </w:pPr>
+      <w:r>
+        <w:t>Gradient-check each new op individually before combining.</w:t>
+      </w:r>
+    </w:p>
+    <w:p>
+      <w:pPr>
+        <w:rPr>
+          <w:b/>
+          <w:bCs/>
+        </w:rPr>
+      </w:pPr>
+      <w:r>
+        <w:rPr>
+          <w:b/>
+          <w:bCs/>
+        </w:rPr>
+        <w:t>Suggested build order</w:t>
+      </w:r>
+    </w:p>
+    <w:p>
+      <w:pPr>
+        <w:numPr>
+          <w:ilvl w:val="0"/>
+          <w:numId w:val="8"/>
+        </w:numPr>
+      </w:pPr>
+      <w:r>
+        <w:t>Bilinear differentiable grid read → gradient-check in isolation.</w:t>
+      </w:r>
+    </w:p>
+    <w:p>
+      <w:pPr>
+        <w:numPr>
+          <w:ilvl w:val="0"/>
+          <w:numId w:val="8"/>
+        </w:numPr>
+      </w:pPr>
+      <w:r>
+        <w:t>Wire into a trivial one-step walk + scalar loss, confirm gradients flow.</w:t>
+      </w:r>
+    </w:p>
+    <w:p>
+      <w:pPr>
+        <w:numPr>
+          <w:ilvl w:val="0"/>
+          <w:numId w:val="8"/>
+        </w:numPr>
+      </w:pPr>
+      <w:r>
+        <w:t xml:space="preserve">Add embedding table + </w:t>
+      </w:r>
+      <w:proofErr w:type="spellStart"/>
+      <w:r>
+        <w:t>W_q</w:t>
+      </w:r>
+      <w:proofErr w:type="spellEnd"/>
+      <w:r>
+        <w:t>/</w:t>
+      </w:r>
+      <w:proofErr w:type="spellStart"/>
+      <w:r>
+        <w:t>W_k</w:t>
+      </w:r>
+      <w:proofErr w:type="spellEnd"/>
+      <w:r>
+        <w:t>/</w:t>
+      </w:r>
+      <w:proofErr w:type="spellStart"/>
+      <w:r>
+        <w:t>W_v</w:t>
+      </w:r>
+      <w:proofErr w:type="spellEnd"/>
+      <w:r>
+        <w:t>, magnitude score → gradient-check.</w:t>
+      </w:r>
+    </w:p>
+    <w:p>
+      <w:pPr>
+        <w:numPr>
+          <w:ilvl w:val="0"/>
+          <w:numId w:val="8"/>
+        </w:numPr>
+      </w:pPr>
+      <w:r>
+        <w:t>Add contextualized/movable embeddings (weighted sum or additive offset) → gradient-check.</w:t>
+      </w:r>
+    </w:p>
+    <w:p>
+      <w:pPr>
+        <w:numPr>
+          <w:ilvl w:val="0"/>
+          <w:numId w:val="8"/>
+        </w:numPr>
+      </w:pPr>
+      <w:r>
+        <w:t>Add direction output → gradient-check.</w:t>
+      </w:r>
+    </w:p>
+    <w:p>
+      <w:pPr>
+        <w:numPr>
+          <w:ilvl w:val="0"/>
+          <w:numId w:val="8"/>
+        </w:numPr>
+      </w:pPr>
+      <w:r>
+        <w:t>Assemble full walker step, gradient-check end-to-end.</w:t>
+      </w:r>
+    </w:p>
+    <w:p>
+      <w:proofErr w:type="spellStart"/>
+      <w:r>
+        <w:lastRenderedPageBreak/>
+        <w:t>Attemped</w:t>
+      </w:r>
+      <w:proofErr w:type="spellEnd"/>
+      <w:r>
+        <w:t xml:space="preserve"> to add these but resulted in either very poor or </w:t>
+      </w:r>
+      <w:proofErr w:type="spellStart"/>
+      <w:r>
+        <w:t>nonexistant</w:t>
+      </w:r>
+      <w:proofErr w:type="spellEnd"/>
+      <w:r>
+        <w:t xml:space="preserve"> learning as well as exploding gradients and other bad issues on top of VERY poorly learning. Possibly time to mark V4.2 or the V4 series a failure. I think the issue is </w:t>
+      </w:r>
+      <w:proofErr w:type="gramStart"/>
+      <w:r>
+        <w:t>similar to</w:t>
+      </w:r>
+      <w:proofErr w:type="gramEnd"/>
+      <w:r>
+        <w:t xml:space="preserve"> algebra. When an equation has two variables such as x + y = 10 it becomes impossible to figure out the exact value of X. I suspect something similar is at play here.</w:t>
+      </w:r>
+    </w:p>
+    <w:p>
+      <w:r>
+        <w:t>V4 has been marked under failure for unknown reasons (For now)</w:t>
       </w:r>
     </w:p>
     <w:sectPr>
@@ -539,6 +1476,1191 @@
     </w:sectPr>
   </w:body>
 </w:document>
+</file>
+
+<file path=word/numbering.xml><?xml version="1.0" encoding="utf-8"?>
+<w:numbering xmlns:wpc="http://schemas.microsoft.com/office/word/2010/wordprocessingCanvas" xmlns:cx="http://schemas.microsoft.com/office/drawing/2014/chartex" xmlns:cx1="http://schemas.microsoft.com/office/drawing/2015/9/8/chartex" xmlns:cx2="http://schemas.microsoft.com/office/drawing/2015/10/21/chartex" xmlns:cx3="http://schemas.microsoft.com/office/drawing/2016/5/9/chartex" xmlns:cx4="http://schemas.microsoft.com/office/drawing/2016/5/10/chartex" xmlns:cx5="http://schemas.microsoft.com/office/drawing/2016/5/11/chartex" xmlns:cx6="http://schemas.microsoft.com/office/drawing/2016/5/12/chartex" xmlns:cx7="http://schemas.microsoft.com/office/drawing/2016/5/13/chartex" xmlns:cx8="http://schemas.microsoft.com/office/drawing/2016/5/14/chartex" xmlns:mc="http://schemas.openxmlformats.org/markup-compatibility/2006" xmlns:aink="http://schemas.microsoft.com/office/drawing/2016/ink" xmlns:am3d="http://schemas.microsoft.com/office/drawing/2017/model3d" xmlns:o="urn:schemas-microsoft-com:office:office" xmlns:oel="http://schemas.microsoft.com/office/2019/extlst" xmlns:r="http://schemas.openxmlformats.org/officeDocument/2006/relationships" xmlns:m="http://schemas.openxmlformats.org/officeDocument/2006/math" xmlns:v="urn:schemas-microsoft-com:vml" xmlns:wp14="http://schemas.microsoft.com/office/word/2010/wordprocessingDrawing" xmlns:wp="http://schemas.openxmlformats.org/drawingml/2006/wordprocessingDrawing" xmlns:w10="urn:schemas-microsoft-com:office:word" xmlns:w="http://schemas.openxmlformats.org/wordprocessingml/2006/main" xmlns:w14="http://schemas.microsoft.com/office/word/2010/wordml" xmlns:w15="http://schemas.microsoft.com/office/word/2012/wordml" xmlns:w16cex="http://schemas.microsoft.com/office/word/2018/wordml/cex" xmlns:w16cid="http://schemas.microsoft.com/office/word/2016/wordml/cid" xmlns:w16="http://schemas.microsoft.com/office/word/2018/wordml" xmlns:w16du="http://schemas.microsoft.com/office/word/2023/wordml/word16du" xmlns:w16sdtdh="http://schemas.microsoft.com/office/word/2020/wordml/sdtdatahash" xmlns:w16sdtfl="http://schemas.microsoft.com/office/word/2024/wordml/sdtformatlock" xmlns:w16se="http://schemas.microsoft.com/office/word/2015/wordml/symex" xmlns:wpg="http://schemas.microsoft.com/office/word/2010/wordprocessingGroup" xmlns:wpi="http://schemas.microsoft.com/office/word/2010/wordprocessingInk" xmlns:wne="http://schemas.microsoft.com/office/word/2006/wordml" xmlns:wps="http://schemas.microsoft.com/office/word/2010/wordprocessingShape" mc:Ignorable="w14 w15 w16se w16cid w16 w16cex w16sdtdh w16sdtfl w16du wp14">
+  <w:abstractNum w:abstractNumId="0" w15:restartNumberingAfterBreak="0">
+    <w:nsid w:val="072F4817"/>
+    <w:multiLevelType w:val="multilevel"/>
+    <w:tmpl w:val="D3AE6390"/>
+    <w:lvl w:ilvl="0">
+      <w:start w:val="1"/>
+      <w:numFmt w:val="bullet"/>
+      <w:lvlText w:val=""/>
+      <w:lvlJc w:val="left"/>
+      <w:pPr>
+        <w:tabs>
+          <w:tab w:val="num" w:pos="720"/>
+        </w:tabs>
+        <w:ind w:left="720" w:hanging="360"/>
+      </w:pPr>
+      <w:rPr>
+        <w:rFonts w:ascii="Symbol" w:hAnsi="Symbol" w:hint="default"/>
+        <w:sz w:val="20"/>
+      </w:rPr>
+    </w:lvl>
+    <w:lvl w:ilvl="1" w:tentative="1">
+      <w:start w:val="1"/>
+      <w:numFmt w:val="bullet"/>
+      <w:lvlText w:val="o"/>
+      <w:lvlJc w:val="left"/>
+      <w:pPr>
+        <w:tabs>
+          <w:tab w:val="num" w:pos="1440"/>
+        </w:tabs>
+        <w:ind w:left="1440" w:hanging="360"/>
+      </w:pPr>
+      <w:rPr>
+        <w:rFonts w:ascii="Courier New" w:hAnsi="Courier New" w:hint="default"/>
+        <w:sz w:val="20"/>
+      </w:rPr>
+    </w:lvl>
+    <w:lvl w:ilvl="2" w:tentative="1">
+      <w:start w:val="1"/>
+      <w:numFmt w:val="bullet"/>
+      <w:lvlText w:val=""/>
+      <w:lvlJc w:val="left"/>
+      <w:pPr>
+        <w:tabs>
+          <w:tab w:val="num" w:pos="2160"/>
+        </w:tabs>
+        <w:ind w:left="2160" w:hanging="360"/>
+      </w:pPr>
+      <w:rPr>
+        <w:rFonts w:ascii="Wingdings" w:hAnsi="Wingdings" w:hint="default"/>
+        <w:sz w:val="20"/>
+      </w:rPr>
+    </w:lvl>
+    <w:lvl w:ilvl="3" w:tentative="1">
+      <w:start w:val="1"/>
+      <w:numFmt w:val="bullet"/>
+      <w:lvlText w:val=""/>
+      <w:lvlJc w:val="left"/>
+      <w:pPr>
+        <w:tabs>
+          <w:tab w:val="num" w:pos="2880"/>
+        </w:tabs>
+        <w:ind w:left="2880" w:hanging="360"/>
+      </w:pPr>
+      <w:rPr>
+        <w:rFonts w:ascii="Wingdings" w:hAnsi="Wingdings" w:hint="default"/>
+        <w:sz w:val="20"/>
+      </w:rPr>
+    </w:lvl>
+    <w:lvl w:ilvl="4" w:tentative="1">
+      <w:start w:val="1"/>
+      <w:numFmt w:val="bullet"/>
+      <w:lvlText w:val=""/>
+      <w:lvlJc w:val="left"/>
+      <w:pPr>
+        <w:tabs>
+          <w:tab w:val="num" w:pos="3600"/>
+        </w:tabs>
+        <w:ind w:left="3600" w:hanging="360"/>
+      </w:pPr>
+      <w:rPr>
+        <w:rFonts w:ascii="Wingdings" w:hAnsi="Wingdings" w:hint="default"/>
+        <w:sz w:val="20"/>
+      </w:rPr>
+    </w:lvl>
+    <w:lvl w:ilvl="5" w:tentative="1">
+      <w:start w:val="1"/>
+      <w:numFmt w:val="bullet"/>
+      <w:lvlText w:val=""/>
+      <w:lvlJc w:val="left"/>
+      <w:pPr>
+        <w:tabs>
+          <w:tab w:val="num" w:pos="4320"/>
+        </w:tabs>
+        <w:ind w:left="4320" w:hanging="360"/>
+      </w:pPr>
+      <w:rPr>
+        <w:rFonts w:ascii="Wingdings" w:hAnsi="Wingdings" w:hint="default"/>
+        <w:sz w:val="20"/>
+      </w:rPr>
+    </w:lvl>
+    <w:lvl w:ilvl="6" w:tentative="1">
+      <w:start w:val="1"/>
+      <w:numFmt w:val="bullet"/>
+      <w:lvlText w:val=""/>
+      <w:lvlJc w:val="left"/>
+      <w:pPr>
+        <w:tabs>
+          <w:tab w:val="num" w:pos="5040"/>
+        </w:tabs>
+        <w:ind w:left="5040" w:hanging="360"/>
+      </w:pPr>
+      <w:rPr>
+        <w:rFonts w:ascii="Wingdings" w:hAnsi="Wingdings" w:hint="default"/>
+        <w:sz w:val="20"/>
+      </w:rPr>
+    </w:lvl>
+    <w:lvl w:ilvl="7" w:tentative="1">
+      <w:start w:val="1"/>
+      <w:numFmt w:val="bullet"/>
+      <w:lvlText w:val=""/>
+      <w:lvlJc w:val="left"/>
+      <w:pPr>
+        <w:tabs>
+          <w:tab w:val="num" w:pos="5760"/>
+        </w:tabs>
+        <w:ind w:left="5760" w:hanging="360"/>
+      </w:pPr>
+      <w:rPr>
+        <w:rFonts w:ascii="Wingdings" w:hAnsi="Wingdings" w:hint="default"/>
+        <w:sz w:val="20"/>
+      </w:rPr>
+    </w:lvl>
+    <w:lvl w:ilvl="8" w:tentative="1">
+      <w:start w:val="1"/>
+      <w:numFmt w:val="bullet"/>
+      <w:lvlText w:val=""/>
+      <w:lvlJc w:val="left"/>
+      <w:pPr>
+        <w:tabs>
+          <w:tab w:val="num" w:pos="6480"/>
+        </w:tabs>
+        <w:ind w:left="6480" w:hanging="360"/>
+      </w:pPr>
+      <w:rPr>
+        <w:rFonts w:ascii="Wingdings" w:hAnsi="Wingdings" w:hint="default"/>
+        <w:sz w:val="20"/>
+      </w:rPr>
+    </w:lvl>
+  </w:abstractNum>
+  <w:abstractNum w:abstractNumId="1" w15:restartNumberingAfterBreak="0">
+    <w:nsid w:val="0D0947E5"/>
+    <w:multiLevelType w:val="multilevel"/>
+    <w:tmpl w:val="D0F6F60A"/>
+    <w:lvl w:ilvl="0">
+      <w:start w:val="1"/>
+      <w:numFmt w:val="decimal"/>
+      <w:lvlText w:val="%1."/>
+      <w:lvlJc w:val="left"/>
+      <w:pPr>
+        <w:tabs>
+          <w:tab w:val="num" w:pos="720"/>
+        </w:tabs>
+        <w:ind w:left="720" w:hanging="360"/>
+      </w:pPr>
+    </w:lvl>
+    <w:lvl w:ilvl="1" w:tentative="1">
+      <w:start w:val="1"/>
+      <w:numFmt w:val="decimal"/>
+      <w:lvlText w:val="%2."/>
+      <w:lvlJc w:val="left"/>
+      <w:pPr>
+        <w:tabs>
+          <w:tab w:val="num" w:pos="1440"/>
+        </w:tabs>
+        <w:ind w:left="1440" w:hanging="360"/>
+      </w:pPr>
+    </w:lvl>
+    <w:lvl w:ilvl="2" w:tentative="1">
+      <w:start w:val="1"/>
+      <w:numFmt w:val="decimal"/>
+      <w:lvlText w:val="%3."/>
+      <w:lvlJc w:val="left"/>
+      <w:pPr>
+        <w:tabs>
+          <w:tab w:val="num" w:pos="2160"/>
+        </w:tabs>
+        <w:ind w:left="2160" w:hanging="360"/>
+      </w:pPr>
+    </w:lvl>
+    <w:lvl w:ilvl="3" w:tentative="1">
+      <w:start w:val="1"/>
+      <w:numFmt w:val="decimal"/>
+      <w:lvlText w:val="%4."/>
+      <w:lvlJc w:val="left"/>
+      <w:pPr>
+        <w:tabs>
+          <w:tab w:val="num" w:pos="2880"/>
+        </w:tabs>
+        <w:ind w:left="2880" w:hanging="360"/>
+      </w:pPr>
+    </w:lvl>
+    <w:lvl w:ilvl="4" w:tentative="1">
+      <w:start w:val="1"/>
+      <w:numFmt w:val="decimal"/>
+      <w:lvlText w:val="%5."/>
+      <w:lvlJc w:val="left"/>
+      <w:pPr>
+        <w:tabs>
+          <w:tab w:val="num" w:pos="3600"/>
+        </w:tabs>
+        <w:ind w:left="3600" w:hanging="360"/>
+      </w:pPr>
+    </w:lvl>
+    <w:lvl w:ilvl="5" w:tentative="1">
+      <w:start w:val="1"/>
+      <w:numFmt w:val="decimal"/>
+      <w:lvlText w:val="%6."/>
+      <w:lvlJc w:val="left"/>
+      <w:pPr>
+        <w:tabs>
+          <w:tab w:val="num" w:pos="4320"/>
+        </w:tabs>
+        <w:ind w:left="4320" w:hanging="360"/>
+      </w:pPr>
+    </w:lvl>
+    <w:lvl w:ilvl="6" w:tentative="1">
+      <w:start w:val="1"/>
+      <w:numFmt w:val="decimal"/>
+      <w:lvlText w:val="%7."/>
+      <w:lvlJc w:val="left"/>
+      <w:pPr>
+        <w:tabs>
+          <w:tab w:val="num" w:pos="5040"/>
+        </w:tabs>
+        <w:ind w:left="5040" w:hanging="360"/>
+      </w:pPr>
+    </w:lvl>
+    <w:lvl w:ilvl="7" w:tentative="1">
+      <w:start w:val="1"/>
+      <w:numFmt w:val="decimal"/>
+      <w:lvlText w:val="%8."/>
+      <w:lvlJc w:val="left"/>
+      <w:pPr>
+        <w:tabs>
+          <w:tab w:val="num" w:pos="5760"/>
+        </w:tabs>
+        <w:ind w:left="5760" w:hanging="360"/>
+      </w:pPr>
+    </w:lvl>
+    <w:lvl w:ilvl="8" w:tentative="1">
+      <w:start w:val="1"/>
+      <w:numFmt w:val="decimal"/>
+      <w:lvlText w:val="%9."/>
+      <w:lvlJc w:val="left"/>
+      <w:pPr>
+        <w:tabs>
+          <w:tab w:val="num" w:pos="6480"/>
+        </w:tabs>
+        <w:ind w:left="6480" w:hanging="360"/>
+      </w:pPr>
+    </w:lvl>
+  </w:abstractNum>
+  <w:abstractNum w:abstractNumId="2" w15:restartNumberingAfterBreak="0">
+    <w:nsid w:val="13815FCA"/>
+    <w:multiLevelType w:val="multilevel"/>
+    <w:tmpl w:val="4138930A"/>
+    <w:lvl w:ilvl="0">
+      <w:start w:val="1"/>
+      <w:numFmt w:val="bullet"/>
+      <w:lvlText w:val=""/>
+      <w:lvlJc w:val="left"/>
+      <w:pPr>
+        <w:tabs>
+          <w:tab w:val="num" w:pos="720"/>
+        </w:tabs>
+        <w:ind w:left="720" w:hanging="360"/>
+      </w:pPr>
+      <w:rPr>
+        <w:rFonts w:ascii="Symbol" w:hAnsi="Symbol" w:hint="default"/>
+        <w:sz w:val="20"/>
+      </w:rPr>
+    </w:lvl>
+    <w:lvl w:ilvl="1" w:tentative="1">
+      <w:start w:val="1"/>
+      <w:numFmt w:val="bullet"/>
+      <w:lvlText w:val="o"/>
+      <w:lvlJc w:val="left"/>
+      <w:pPr>
+        <w:tabs>
+          <w:tab w:val="num" w:pos="1440"/>
+        </w:tabs>
+        <w:ind w:left="1440" w:hanging="360"/>
+      </w:pPr>
+      <w:rPr>
+        <w:rFonts w:ascii="Courier New" w:hAnsi="Courier New" w:hint="default"/>
+        <w:sz w:val="20"/>
+      </w:rPr>
+    </w:lvl>
+    <w:lvl w:ilvl="2" w:tentative="1">
+      <w:start w:val="1"/>
+      <w:numFmt w:val="bullet"/>
+      <w:lvlText w:val=""/>
+      <w:lvlJc w:val="left"/>
+      <w:pPr>
+        <w:tabs>
+          <w:tab w:val="num" w:pos="2160"/>
+        </w:tabs>
+        <w:ind w:left="2160" w:hanging="360"/>
+      </w:pPr>
+      <w:rPr>
+        <w:rFonts w:ascii="Wingdings" w:hAnsi="Wingdings" w:hint="default"/>
+        <w:sz w:val="20"/>
+      </w:rPr>
+    </w:lvl>
+    <w:lvl w:ilvl="3" w:tentative="1">
+      <w:start w:val="1"/>
+      <w:numFmt w:val="bullet"/>
+      <w:lvlText w:val=""/>
+      <w:lvlJc w:val="left"/>
+      <w:pPr>
+        <w:tabs>
+          <w:tab w:val="num" w:pos="2880"/>
+        </w:tabs>
+        <w:ind w:left="2880" w:hanging="360"/>
+      </w:pPr>
+      <w:rPr>
+        <w:rFonts w:ascii="Wingdings" w:hAnsi="Wingdings" w:hint="default"/>
+        <w:sz w:val="20"/>
+      </w:rPr>
+    </w:lvl>
+    <w:lvl w:ilvl="4" w:tentative="1">
+      <w:start w:val="1"/>
+      <w:numFmt w:val="bullet"/>
+      <w:lvlText w:val=""/>
+      <w:lvlJc w:val="left"/>
+      <w:pPr>
+        <w:tabs>
+          <w:tab w:val="num" w:pos="3600"/>
+        </w:tabs>
+        <w:ind w:left="3600" w:hanging="360"/>
+      </w:pPr>
+      <w:rPr>
+        <w:rFonts w:ascii="Wingdings" w:hAnsi="Wingdings" w:hint="default"/>
+        <w:sz w:val="20"/>
+      </w:rPr>
+    </w:lvl>
+    <w:lvl w:ilvl="5" w:tentative="1">
+      <w:start w:val="1"/>
+      <w:numFmt w:val="bullet"/>
+      <w:lvlText w:val=""/>
+      <w:lvlJc w:val="left"/>
+      <w:pPr>
+        <w:tabs>
+          <w:tab w:val="num" w:pos="4320"/>
+        </w:tabs>
+        <w:ind w:left="4320" w:hanging="360"/>
+      </w:pPr>
+      <w:rPr>
+        <w:rFonts w:ascii="Wingdings" w:hAnsi="Wingdings" w:hint="default"/>
+        <w:sz w:val="20"/>
+      </w:rPr>
+    </w:lvl>
+    <w:lvl w:ilvl="6" w:tentative="1">
+      <w:start w:val="1"/>
+      <w:numFmt w:val="bullet"/>
+      <w:lvlText w:val=""/>
+      <w:lvlJc w:val="left"/>
+      <w:pPr>
+        <w:tabs>
+          <w:tab w:val="num" w:pos="5040"/>
+        </w:tabs>
+        <w:ind w:left="5040" w:hanging="360"/>
+      </w:pPr>
+      <w:rPr>
+        <w:rFonts w:ascii="Wingdings" w:hAnsi="Wingdings" w:hint="default"/>
+        <w:sz w:val="20"/>
+      </w:rPr>
+    </w:lvl>
+    <w:lvl w:ilvl="7" w:tentative="1">
+      <w:start w:val="1"/>
+      <w:numFmt w:val="bullet"/>
+      <w:lvlText w:val=""/>
+      <w:lvlJc w:val="left"/>
+      <w:pPr>
+        <w:tabs>
+          <w:tab w:val="num" w:pos="5760"/>
+        </w:tabs>
+        <w:ind w:left="5760" w:hanging="360"/>
+      </w:pPr>
+      <w:rPr>
+        <w:rFonts w:ascii="Wingdings" w:hAnsi="Wingdings" w:hint="default"/>
+        <w:sz w:val="20"/>
+      </w:rPr>
+    </w:lvl>
+    <w:lvl w:ilvl="8" w:tentative="1">
+      <w:start w:val="1"/>
+      <w:numFmt w:val="bullet"/>
+      <w:lvlText w:val=""/>
+      <w:lvlJc w:val="left"/>
+      <w:pPr>
+        <w:tabs>
+          <w:tab w:val="num" w:pos="6480"/>
+        </w:tabs>
+        <w:ind w:left="6480" w:hanging="360"/>
+      </w:pPr>
+      <w:rPr>
+        <w:rFonts w:ascii="Wingdings" w:hAnsi="Wingdings" w:hint="default"/>
+        <w:sz w:val="20"/>
+      </w:rPr>
+    </w:lvl>
+  </w:abstractNum>
+  <w:abstractNum w:abstractNumId="3" w15:restartNumberingAfterBreak="0">
+    <w:nsid w:val="1FCB59B8"/>
+    <w:multiLevelType w:val="multilevel"/>
+    <w:tmpl w:val="472CBE4C"/>
+    <w:lvl w:ilvl="0">
+      <w:start w:val="1"/>
+      <w:numFmt w:val="bullet"/>
+      <w:lvlText w:val=""/>
+      <w:lvlJc w:val="left"/>
+      <w:pPr>
+        <w:tabs>
+          <w:tab w:val="num" w:pos="720"/>
+        </w:tabs>
+        <w:ind w:left="720" w:hanging="360"/>
+      </w:pPr>
+      <w:rPr>
+        <w:rFonts w:ascii="Symbol" w:hAnsi="Symbol" w:hint="default"/>
+        <w:sz w:val="20"/>
+      </w:rPr>
+    </w:lvl>
+    <w:lvl w:ilvl="1" w:tentative="1">
+      <w:start w:val="1"/>
+      <w:numFmt w:val="bullet"/>
+      <w:lvlText w:val="o"/>
+      <w:lvlJc w:val="left"/>
+      <w:pPr>
+        <w:tabs>
+          <w:tab w:val="num" w:pos="1440"/>
+        </w:tabs>
+        <w:ind w:left="1440" w:hanging="360"/>
+      </w:pPr>
+      <w:rPr>
+        <w:rFonts w:ascii="Courier New" w:hAnsi="Courier New" w:hint="default"/>
+        <w:sz w:val="20"/>
+      </w:rPr>
+    </w:lvl>
+    <w:lvl w:ilvl="2" w:tentative="1">
+      <w:start w:val="1"/>
+      <w:numFmt w:val="bullet"/>
+      <w:lvlText w:val=""/>
+      <w:lvlJc w:val="left"/>
+      <w:pPr>
+        <w:tabs>
+          <w:tab w:val="num" w:pos="2160"/>
+        </w:tabs>
+        <w:ind w:left="2160" w:hanging="360"/>
+      </w:pPr>
+      <w:rPr>
+        <w:rFonts w:ascii="Wingdings" w:hAnsi="Wingdings" w:hint="default"/>
+        <w:sz w:val="20"/>
+      </w:rPr>
+    </w:lvl>
+    <w:lvl w:ilvl="3" w:tentative="1">
+      <w:start w:val="1"/>
+      <w:numFmt w:val="bullet"/>
+      <w:lvlText w:val=""/>
+      <w:lvlJc w:val="left"/>
+      <w:pPr>
+        <w:tabs>
+          <w:tab w:val="num" w:pos="2880"/>
+        </w:tabs>
+        <w:ind w:left="2880" w:hanging="360"/>
+      </w:pPr>
+      <w:rPr>
+        <w:rFonts w:ascii="Wingdings" w:hAnsi="Wingdings" w:hint="default"/>
+        <w:sz w:val="20"/>
+      </w:rPr>
+    </w:lvl>
+    <w:lvl w:ilvl="4" w:tentative="1">
+      <w:start w:val="1"/>
+      <w:numFmt w:val="bullet"/>
+      <w:lvlText w:val=""/>
+      <w:lvlJc w:val="left"/>
+      <w:pPr>
+        <w:tabs>
+          <w:tab w:val="num" w:pos="3600"/>
+        </w:tabs>
+        <w:ind w:left="3600" w:hanging="360"/>
+      </w:pPr>
+      <w:rPr>
+        <w:rFonts w:ascii="Wingdings" w:hAnsi="Wingdings" w:hint="default"/>
+        <w:sz w:val="20"/>
+      </w:rPr>
+    </w:lvl>
+    <w:lvl w:ilvl="5" w:tentative="1">
+      <w:start w:val="1"/>
+      <w:numFmt w:val="bullet"/>
+      <w:lvlText w:val=""/>
+      <w:lvlJc w:val="left"/>
+      <w:pPr>
+        <w:tabs>
+          <w:tab w:val="num" w:pos="4320"/>
+        </w:tabs>
+        <w:ind w:left="4320" w:hanging="360"/>
+      </w:pPr>
+      <w:rPr>
+        <w:rFonts w:ascii="Wingdings" w:hAnsi="Wingdings" w:hint="default"/>
+        <w:sz w:val="20"/>
+      </w:rPr>
+    </w:lvl>
+    <w:lvl w:ilvl="6" w:tentative="1">
+      <w:start w:val="1"/>
+      <w:numFmt w:val="bullet"/>
+      <w:lvlText w:val=""/>
+      <w:lvlJc w:val="left"/>
+      <w:pPr>
+        <w:tabs>
+          <w:tab w:val="num" w:pos="5040"/>
+        </w:tabs>
+        <w:ind w:left="5040" w:hanging="360"/>
+      </w:pPr>
+      <w:rPr>
+        <w:rFonts w:ascii="Wingdings" w:hAnsi="Wingdings" w:hint="default"/>
+        <w:sz w:val="20"/>
+      </w:rPr>
+    </w:lvl>
+    <w:lvl w:ilvl="7" w:tentative="1">
+      <w:start w:val="1"/>
+      <w:numFmt w:val="bullet"/>
+      <w:lvlText w:val=""/>
+      <w:lvlJc w:val="left"/>
+      <w:pPr>
+        <w:tabs>
+          <w:tab w:val="num" w:pos="5760"/>
+        </w:tabs>
+        <w:ind w:left="5760" w:hanging="360"/>
+      </w:pPr>
+      <w:rPr>
+        <w:rFonts w:ascii="Wingdings" w:hAnsi="Wingdings" w:hint="default"/>
+        <w:sz w:val="20"/>
+      </w:rPr>
+    </w:lvl>
+    <w:lvl w:ilvl="8" w:tentative="1">
+      <w:start w:val="1"/>
+      <w:numFmt w:val="bullet"/>
+      <w:lvlText w:val=""/>
+      <w:lvlJc w:val="left"/>
+      <w:pPr>
+        <w:tabs>
+          <w:tab w:val="num" w:pos="6480"/>
+        </w:tabs>
+        <w:ind w:left="6480" w:hanging="360"/>
+      </w:pPr>
+      <w:rPr>
+        <w:rFonts w:ascii="Wingdings" w:hAnsi="Wingdings" w:hint="default"/>
+        <w:sz w:val="20"/>
+      </w:rPr>
+    </w:lvl>
+  </w:abstractNum>
+  <w:abstractNum w:abstractNumId="4" w15:restartNumberingAfterBreak="0">
+    <w:nsid w:val="43BC413C"/>
+    <w:multiLevelType w:val="multilevel"/>
+    <w:tmpl w:val="C750BC80"/>
+    <w:lvl w:ilvl="0">
+      <w:start w:val="1"/>
+      <w:numFmt w:val="bullet"/>
+      <w:lvlText w:val=""/>
+      <w:lvlJc w:val="left"/>
+      <w:pPr>
+        <w:tabs>
+          <w:tab w:val="num" w:pos="720"/>
+        </w:tabs>
+        <w:ind w:left="720" w:hanging="360"/>
+      </w:pPr>
+      <w:rPr>
+        <w:rFonts w:ascii="Symbol" w:hAnsi="Symbol" w:hint="default"/>
+        <w:sz w:val="20"/>
+      </w:rPr>
+    </w:lvl>
+    <w:lvl w:ilvl="1" w:tentative="1">
+      <w:start w:val="1"/>
+      <w:numFmt w:val="bullet"/>
+      <w:lvlText w:val="o"/>
+      <w:lvlJc w:val="left"/>
+      <w:pPr>
+        <w:tabs>
+          <w:tab w:val="num" w:pos="1440"/>
+        </w:tabs>
+        <w:ind w:left="1440" w:hanging="360"/>
+      </w:pPr>
+      <w:rPr>
+        <w:rFonts w:ascii="Courier New" w:hAnsi="Courier New" w:hint="default"/>
+        <w:sz w:val="20"/>
+      </w:rPr>
+    </w:lvl>
+    <w:lvl w:ilvl="2" w:tentative="1">
+      <w:start w:val="1"/>
+      <w:numFmt w:val="bullet"/>
+      <w:lvlText w:val=""/>
+      <w:lvlJc w:val="left"/>
+      <w:pPr>
+        <w:tabs>
+          <w:tab w:val="num" w:pos="2160"/>
+        </w:tabs>
+        <w:ind w:left="2160" w:hanging="360"/>
+      </w:pPr>
+      <w:rPr>
+        <w:rFonts w:ascii="Wingdings" w:hAnsi="Wingdings" w:hint="default"/>
+        <w:sz w:val="20"/>
+      </w:rPr>
+    </w:lvl>
+    <w:lvl w:ilvl="3" w:tentative="1">
+      <w:start w:val="1"/>
+      <w:numFmt w:val="bullet"/>
+      <w:lvlText w:val=""/>
+      <w:lvlJc w:val="left"/>
+      <w:pPr>
+        <w:tabs>
+          <w:tab w:val="num" w:pos="2880"/>
+        </w:tabs>
+        <w:ind w:left="2880" w:hanging="360"/>
+      </w:pPr>
+      <w:rPr>
+        <w:rFonts w:ascii="Wingdings" w:hAnsi="Wingdings" w:hint="default"/>
+        <w:sz w:val="20"/>
+      </w:rPr>
+    </w:lvl>
+    <w:lvl w:ilvl="4" w:tentative="1">
+      <w:start w:val="1"/>
+      <w:numFmt w:val="bullet"/>
+      <w:lvlText w:val=""/>
+      <w:lvlJc w:val="left"/>
+      <w:pPr>
+        <w:tabs>
+          <w:tab w:val="num" w:pos="3600"/>
+        </w:tabs>
+        <w:ind w:left="3600" w:hanging="360"/>
+      </w:pPr>
+      <w:rPr>
+        <w:rFonts w:ascii="Wingdings" w:hAnsi="Wingdings" w:hint="default"/>
+        <w:sz w:val="20"/>
+      </w:rPr>
+    </w:lvl>
+    <w:lvl w:ilvl="5" w:tentative="1">
+      <w:start w:val="1"/>
+      <w:numFmt w:val="bullet"/>
+      <w:lvlText w:val=""/>
+      <w:lvlJc w:val="left"/>
+      <w:pPr>
+        <w:tabs>
+          <w:tab w:val="num" w:pos="4320"/>
+        </w:tabs>
+        <w:ind w:left="4320" w:hanging="360"/>
+      </w:pPr>
+      <w:rPr>
+        <w:rFonts w:ascii="Wingdings" w:hAnsi="Wingdings" w:hint="default"/>
+        <w:sz w:val="20"/>
+      </w:rPr>
+    </w:lvl>
+    <w:lvl w:ilvl="6" w:tentative="1">
+      <w:start w:val="1"/>
+      <w:numFmt w:val="bullet"/>
+      <w:lvlText w:val=""/>
+      <w:lvlJc w:val="left"/>
+      <w:pPr>
+        <w:tabs>
+          <w:tab w:val="num" w:pos="5040"/>
+        </w:tabs>
+        <w:ind w:left="5040" w:hanging="360"/>
+      </w:pPr>
+      <w:rPr>
+        <w:rFonts w:ascii="Wingdings" w:hAnsi="Wingdings" w:hint="default"/>
+        <w:sz w:val="20"/>
+      </w:rPr>
+    </w:lvl>
+    <w:lvl w:ilvl="7" w:tentative="1">
+      <w:start w:val="1"/>
+      <w:numFmt w:val="bullet"/>
+      <w:lvlText w:val=""/>
+      <w:lvlJc w:val="left"/>
+      <w:pPr>
+        <w:tabs>
+          <w:tab w:val="num" w:pos="5760"/>
+        </w:tabs>
+        <w:ind w:left="5760" w:hanging="360"/>
+      </w:pPr>
+      <w:rPr>
+        <w:rFonts w:ascii="Wingdings" w:hAnsi="Wingdings" w:hint="default"/>
+        <w:sz w:val="20"/>
+      </w:rPr>
+    </w:lvl>
+    <w:lvl w:ilvl="8" w:tentative="1">
+      <w:start w:val="1"/>
+      <w:numFmt w:val="bullet"/>
+      <w:lvlText w:val=""/>
+      <w:lvlJc w:val="left"/>
+      <w:pPr>
+        <w:tabs>
+          <w:tab w:val="num" w:pos="6480"/>
+        </w:tabs>
+        <w:ind w:left="6480" w:hanging="360"/>
+      </w:pPr>
+      <w:rPr>
+        <w:rFonts w:ascii="Wingdings" w:hAnsi="Wingdings" w:hint="default"/>
+        <w:sz w:val="20"/>
+      </w:rPr>
+    </w:lvl>
+  </w:abstractNum>
+  <w:abstractNum w:abstractNumId="5" w15:restartNumberingAfterBreak="0">
+    <w:nsid w:val="45A4622F"/>
+    <w:multiLevelType w:val="multilevel"/>
+    <w:tmpl w:val="DA00CCEC"/>
+    <w:lvl w:ilvl="0">
+      <w:start w:val="1"/>
+      <w:numFmt w:val="bullet"/>
+      <w:lvlText w:val=""/>
+      <w:lvlJc w:val="left"/>
+      <w:pPr>
+        <w:tabs>
+          <w:tab w:val="num" w:pos="720"/>
+        </w:tabs>
+        <w:ind w:left="720" w:hanging="360"/>
+      </w:pPr>
+      <w:rPr>
+        <w:rFonts w:ascii="Symbol" w:hAnsi="Symbol" w:hint="default"/>
+        <w:sz w:val="20"/>
+      </w:rPr>
+    </w:lvl>
+    <w:lvl w:ilvl="1" w:tentative="1">
+      <w:start w:val="1"/>
+      <w:numFmt w:val="bullet"/>
+      <w:lvlText w:val="o"/>
+      <w:lvlJc w:val="left"/>
+      <w:pPr>
+        <w:tabs>
+          <w:tab w:val="num" w:pos="1440"/>
+        </w:tabs>
+        <w:ind w:left="1440" w:hanging="360"/>
+      </w:pPr>
+      <w:rPr>
+        <w:rFonts w:ascii="Courier New" w:hAnsi="Courier New" w:hint="default"/>
+        <w:sz w:val="20"/>
+      </w:rPr>
+    </w:lvl>
+    <w:lvl w:ilvl="2" w:tentative="1">
+      <w:start w:val="1"/>
+      <w:numFmt w:val="bullet"/>
+      <w:lvlText w:val=""/>
+      <w:lvlJc w:val="left"/>
+      <w:pPr>
+        <w:tabs>
+          <w:tab w:val="num" w:pos="2160"/>
+        </w:tabs>
+        <w:ind w:left="2160" w:hanging="360"/>
+      </w:pPr>
+      <w:rPr>
+        <w:rFonts w:ascii="Wingdings" w:hAnsi="Wingdings" w:hint="default"/>
+        <w:sz w:val="20"/>
+      </w:rPr>
+    </w:lvl>
+    <w:lvl w:ilvl="3" w:tentative="1">
+      <w:start w:val="1"/>
+      <w:numFmt w:val="bullet"/>
+      <w:lvlText w:val=""/>
+      <w:lvlJc w:val="left"/>
+      <w:pPr>
+        <w:tabs>
+          <w:tab w:val="num" w:pos="2880"/>
+        </w:tabs>
+        <w:ind w:left="2880" w:hanging="360"/>
+      </w:pPr>
+      <w:rPr>
+        <w:rFonts w:ascii="Wingdings" w:hAnsi="Wingdings" w:hint="default"/>
+        <w:sz w:val="20"/>
+      </w:rPr>
+    </w:lvl>
+    <w:lvl w:ilvl="4" w:tentative="1">
+      <w:start w:val="1"/>
+      <w:numFmt w:val="bullet"/>
+      <w:lvlText w:val=""/>
+      <w:lvlJc w:val="left"/>
+      <w:pPr>
+        <w:tabs>
+          <w:tab w:val="num" w:pos="3600"/>
+        </w:tabs>
+        <w:ind w:left="3600" w:hanging="360"/>
+      </w:pPr>
+      <w:rPr>
+        <w:rFonts w:ascii="Wingdings" w:hAnsi="Wingdings" w:hint="default"/>
+        <w:sz w:val="20"/>
+      </w:rPr>
+    </w:lvl>
+    <w:lvl w:ilvl="5" w:tentative="1">
+      <w:start w:val="1"/>
+      <w:numFmt w:val="bullet"/>
+      <w:lvlText w:val=""/>
+      <w:lvlJc w:val="left"/>
+      <w:pPr>
+        <w:tabs>
+          <w:tab w:val="num" w:pos="4320"/>
+        </w:tabs>
+        <w:ind w:left="4320" w:hanging="360"/>
+      </w:pPr>
+      <w:rPr>
+        <w:rFonts w:ascii="Wingdings" w:hAnsi="Wingdings" w:hint="default"/>
+        <w:sz w:val="20"/>
+      </w:rPr>
+    </w:lvl>
+    <w:lvl w:ilvl="6" w:tentative="1">
+      <w:start w:val="1"/>
+      <w:numFmt w:val="bullet"/>
+      <w:lvlText w:val=""/>
+      <w:lvlJc w:val="left"/>
+      <w:pPr>
+        <w:tabs>
+          <w:tab w:val="num" w:pos="5040"/>
+        </w:tabs>
+        <w:ind w:left="5040" w:hanging="360"/>
+      </w:pPr>
+      <w:rPr>
+        <w:rFonts w:ascii="Wingdings" w:hAnsi="Wingdings" w:hint="default"/>
+        <w:sz w:val="20"/>
+      </w:rPr>
+    </w:lvl>
+    <w:lvl w:ilvl="7" w:tentative="1">
+      <w:start w:val="1"/>
+      <w:numFmt w:val="bullet"/>
+      <w:lvlText w:val=""/>
+      <w:lvlJc w:val="left"/>
+      <w:pPr>
+        <w:tabs>
+          <w:tab w:val="num" w:pos="5760"/>
+        </w:tabs>
+        <w:ind w:left="5760" w:hanging="360"/>
+      </w:pPr>
+      <w:rPr>
+        <w:rFonts w:ascii="Wingdings" w:hAnsi="Wingdings" w:hint="default"/>
+        <w:sz w:val="20"/>
+      </w:rPr>
+    </w:lvl>
+    <w:lvl w:ilvl="8" w:tentative="1">
+      <w:start w:val="1"/>
+      <w:numFmt w:val="bullet"/>
+      <w:lvlText w:val=""/>
+      <w:lvlJc w:val="left"/>
+      <w:pPr>
+        <w:tabs>
+          <w:tab w:val="num" w:pos="6480"/>
+        </w:tabs>
+        <w:ind w:left="6480" w:hanging="360"/>
+      </w:pPr>
+      <w:rPr>
+        <w:rFonts w:ascii="Wingdings" w:hAnsi="Wingdings" w:hint="default"/>
+        <w:sz w:val="20"/>
+      </w:rPr>
+    </w:lvl>
+  </w:abstractNum>
+  <w:abstractNum w:abstractNumId="6" w15:restartNumberingAfterBreak="0">
+    <w:nsid w:val="4EE43BF0"/>
+    <w:multiLevelType w:val="multilevel"/>
+    <w:tmpl w:val="4266A3D4"/>
+    <w:lvl w:ilvl="0">
+      <w:start w:val="1"/>
+      <w:numFmt w:val="bullet"/>
+      <w:lvlText w:val=""/>
+      <w:lvlJc w:val="left"/>
+      <w:pPr>
+        <w:tabs>
+          <w:tab w:val="num" w:pos="720"/>
+        </w:tabs>
+        <w:ind w:left="720" w:hanging="360"/>
+      </w:pPr>
+      <w:rPr>
+        <w:rFonts w:ascii="Symbol" w:hAnsi="Symbol" w:hint="default"/>
+        <w:sz w:val="20"/>
+      </w:rPr>
+    </w:lvl>
+    <w:lvl w:ilvl="1" w:tentative="1">
+      <w:start w:val="1"/>
+      <w:numFmt w:val="bullet"/>
+      <w:lvlText w:val="o"/>
+      <w:lvlJc w:val="left"/>
+      <w:pPr>
+        <w:tabs>
+          <w:tab w:val="num" w:pos="1440"/>
+        </w:tabs>
+        <w:ind w:left="1440" w:hanging="360"/>
+      </w:pPr>
+      <w:rPr>
+        <w:rFonts w:ascii="Courier New" w:hAnsi="Courier New" w:hint="default"/>
+        <w:sz w:val="20"/>
+      </w:rPr>
+    </w:lvl>
+    <w:lvl w:ilvl="2" w:tentative="1">
+      <w:start w:val="1"/>
+      <w:numFmt w:val="bullet"/>
+      <w:lvlText w:val=""/>
+      <w:lvlJc w:val="left"/>
+      <w:pPr>
+        <w:tabs>
+          <w:tab w:val="num" w:pos="2160"/>
+        </w:tabs>
+        <w:ind w:left="2160" w:hanging="360"/>
+      </w:pPr>
+      <w:rPr>
+        <w:rFonts w:ascii="Wingdings" w:hAnsi="Wingdings" w:hint="default"/>
+        <w:sz w:val="20"/>
+      </w:rPr>
+    </w:lvl>
+    <w:lvl w:ilvl="3" w:tentative="1">
+      <w:start w:val="1"/>
+      <w:numFmt w:val="bullet"/>
+      <w:lvlText w:val=""/>
+      <w:lvlJc w:val="left"/>
+      <w:pPr>
+        <w:tabs>
+          <w:tab w:val="num" w:pos="2880"/>
+        </w:tabs>
+        <w:ind w:left="2880" w:hanging="360"/>
+      </w:pPr>
+      <w:rPr>
+        <w:rFonts w:ascii="Wingdings" w:hAnsi="Wingdings" w:hint="default"/>
+        <w:sz w:val="20"/>
+      </w:rPr>
+    </w:lvl>
+    <w:lvl w:ilvl="4" w:tentative="1">
+      <w:start w:val="1"/>
+      <w:numFmt w:val="bullet"/>
+      <w:lvlText w:val=""/>
+      <w:lvlJc w:val="left"/>
+      <w:pPr>
+        <w:tabs>
+          <w:tab w:val="num" w:pos="3600"/>
+        </w:tabs>
+        <w:ind w:left="3600" w:hanging="360"/>
+      </w:pPr>
+      <w:rPr>
+        <w:rFonts w:ascii="Wingdings" w:hAnsi="Wingdings" w:hint="default"/>
+        <w:sz w:val="20"/>
+      </w:rPr>
+    </w:lvl>
+    <w:lvl w:ilvl="5" w:tentative="1">
+      <w:start w:val="1"/>
+      <w:numFmt w:val="bullet"/>
+      <w:lvlText w:val=""/>
+      <w:lvlJc w:val="left"/>
+      <w:pPr>
+        <w:tabs>
+          <w:tab w:val="num" w:pos="4320"/>
+        </w:tabs>
+        <w:ind w:left="4320" w:hanging="360"/>
+      </w:pPr>
+      <w:rPr>
+        <w:rFonts w:ascii="Wingdings" w:hAnsi="Wingdings" w:hint="default"/>
+        <w:sz w:val="20"/>
+      </w:rPr>
+    </w:lvl>
+    <w:lvl w:ilvl="6" w:tentative="1">
+      <w:start w:val="1"/>
+      <w:numFmt w:val="bullet"/>
+      <w:lvlText w:val=""/>
+      <w:lvlJc w:val="left"/>
+      <w:pPr>
+        <w:tabs>
+          <w:tab w:val="num" w:pos="5040"/>
+        </w:tabs>
+        <w:ind w:left="5040" w:hanging="360"/>
+      </w:pPr>
+      <w:rPr>
+        <w:rFonts w:ascii="Wingdings" w:hAnsi="Wingdings" w:hint="default"/>
+        <w:sz w:val="20"/>
+      </w:rPr>
+    </w:lvl>
+    <w:lvl w:ilvl="7" w:tentative="1">
+      <w:start w:val="1"/>
+      <w:numFmt w:val="bullet"/>
+      <w:lvlText w:val=""/>
+      <w:lvlJc w:val="left"/>
+      <w:pPr>
+        <w:tabs>
+          <w:tab w:val="num" w:pos="5760"/>
+        </w:tabs>
+        <w:ind w:left="5760" w:hanging="360"/>
+      </w:pPr>
+      <w:rPr>
+        <w:rFonts w:ascii="Wingdings" w:hAnsi="Wingdings" w:hint="default"/>
+        <w:sz w:val="20"/>
+      </w:rPr>
+    </w:lvl>
+    <w:lvl w:ilvl="8" w:tentative="1">
+      <w:start w:val="1"/>
+      <w:numFmt w:val="bullet"/>
+      <w:lvlText w:val=""/>
+      <w:lvlJc w:val="left"/>
+      <w:pPr>
+        <w:tabs>
+          <w:tab w:val="num" w:pos="6480"/>
+        </w:tabs>
+        <w:ind w:left="6480" w:hanging="360"/>
+      </w:pPr>
+      <w:rPr>
+        <w:rFonts w:ascii="Wingdings" w:hAnsi="Wingdings" w:hint="default"/>
+        <w:sz w:val="20"/>
+      </w:rPr>
+    </w:lvl>
+  </w:abstractNum>
+  <w:abstractNum w:abstractNumId="7" w15:restartNumberingAfterBreak="0">
+    <w:nsid w:val="5B1E4A22"/>
+    <w:multiLevelType w:val="multilevel"/>
+    <w:tmpl w:val="8FA430D8"/>
+    <w:lvl w:ilvl="0">
+      <w:start w:val="1"/>
+      <w:numFmt w:val="bullet"/>
+      <w:lvlText w:val=""/>
+      <w:lvlJc w:val="left"/>
+      <w:pPr>
+        <w:tabs>
+          <w:tab w:val="num" w:pos="720"/>
+        </w:tabs>
+        <w:ind w:left="720" w:hanging="360"/>
+      </w:pPr>
+      <w:rPr>
+        <w:rFonts w:ascii="Symbol" w:hAnsi="Symbol" w:hint="default"/>
+        <w:sz w:val="20"/>
+      </w:rPr>
+    </w:lvl>
+    <w:lvl w:ilvl="1" w:tentative="1">
+      <w:start w:val="1"/>
+      <w:numFmt w:val="bullet"/>
+      <w:lvlText w:val="o"/>
+      <w:lvlJc w:val="left"/>
+      <w:pPr>
+        <w:tabs>
+          <w:tab w:val="num" w:pos="1440"/>
+        </w:tabs>
+        <w:ind w:left="1440" w:hanging="360"/>
+      </w:pPr>
+      <w:rPr>
+        <w:rFonts w:ascii="Courier New" w:hAnsi="Courier New" w:hint="default"/>
+        <w:sz w:val="20"/>
+      </w:rPr>
+    </w:lvl>
+    <w:lvl w:ilvl="2" w:tentative="1">
+      <w:start w:val="1"/>
+      <w:numFmt w:val="bullet"/>
+      <w:lvlText w:val=""/>
+      <w:lvlJc w:val="left"/>
+      <w:pPr>
+        <w:tabs>
+          <w:tab w:val="num" w:pos="2160"/>
+        </w:tabs>
+        <w:ind w:left="2160" w:hanging="360"/>
+      </w:pPr>
+      <w:rPr>
+        <w:rFonts w:ascii="Wingdings" w:hAnsi="Wingdings" w:hint="default"/>
+        <w:sz w:val="20"/>
+      </w:rPr>
+    </w:lvl>
+    <w:lvl w:ilvl="3" w:tentative="1">
+      <w:start w:val="1"/>
+      <w:numFmt w:val="bullet"/>
+      <w:lvlText w:val=""/>
+      <w:lvlJc w:val="left"/>
+      <w:pPr>
+        <w:tabs>
+          <w:tab w:val="num" w:pos="2880"/>
+        </w:tabs>
+        <w:ind w:left="2880" w:hanging="360"/>
+      </w:pPr>
+      <w:rPr>
+        <w:rFonts w:ascii="Wingdings" w:hAnsi="Wingdings" w:hint="default"/>
+        <w:sz w:val="20"/>
+      </w:rPr>
+    </w:lvl>
+    <w:lvl w:ilvl="4" w:tentative="1">
+      <w:start w:val="1"/>
+      <w:numFmt w:val="bullet"/>
+      <w:lvlText w:val=""/>
+      <w:lvlJc w:val="left"/>
+      <w:pPr>
+        <w:tabs>
+          <w:tab w:val="num" w:pos="3600"/>
+        </w:tabs>
+        <w:ind w:left="3600" w:hanging="360"/>
+      </w:pPr>
+      <w:rPr>
+        <w:rFonts w:ascii="Wingdings" w:hAnsi="Wingdings" w:hint="default"/>
+        <w:sz w:val="20"/>
+      </w:rPr>
+    </w:lvl>
+    <w:lvl w:ilvl="5" w:tentative="1">
+      <w:start w:val="1"/>
+      <w:numFmt w:val="bullet"/>
+      <w:lvlText w:val=""/>
+      <w:lvlJc w:val="left"/>
+      <w:pPr>
+        <w:tabs>
+          <w:tab w:val="num" w:pos="4320"/>
+        </w:tabs>
+        <w:ind w:left="4320" w:hanging="360"/>
+      </w:pPr>
+      <w:rPr>
+        <w:rFonts w:ascii="Wingdings" w:hAnsi="Wingdings" w:hint="default"/>
+        <w:sz w:val="20"/>
+      </w:rPr>
+    </w:lvl>
+    <w:lvl w:ilvl="6" w:tentative="1">
+      <w:start w:val="1"/>
+      <w:numFmt w:val="bullet"/>
+      <w:lvlText w:val=""/>
+      <w:lvlJc w:val="left"/>
+      <w:pPr>
+        <w:tabs>
+          <w:tab w:val="num" w:pos="5040"/>
+        </w:tabs>
+        <w:ind w:left="5040" w:hanging="360"/>
+      </w:pPr>
+      <w:rPr>
+        <w:rFonts w:ascii="Wingdings" w:hAnsi="Wingdings" w:hint="default"/>
+        <w:sz w:val="20"/>
+      </w:rPr>
+    </w:lvl>
+    <w:lvl w:ilvl="7" w:tentative="1">
+      <w:start w:val="1"/>
+      <w:numFmt w:val="bullet"/>
+      <w:lvlText w:val=""/>
+      <w:lvlJc w:val="left"/>
+      <w:pPr>
+        <w:tabs>
+          <w:tab w:val="num" w:pos="5760"/>
+        </w:tabs>
+        <w:ind w:left="5760" w:hanging="360"/>
+      </w:pPr>
+      <w:rPr>
+        <w:rFonts w:ascii="Wingdings" w:hAnsi="Wingdings" w:hint="default"/>
+        <w:sz w:val="20"/>
+      </w:rPr>
+    </w:lvl>
+    <w:lvl w:ilvl="8" w:tentative="1">
+      <w:start w:val="1"/>
+      <w:numFmt w:val="bullet"/>
+      <w:lvlText w:val=""/>
+      <w:lvlJc w:val="left"/>
+      <w:pPr>
+        <w:tabs>
+          <w:tab w:val="num" w:pos="6480"/>
+        </w:tabs>
+        <w:ind w:left="6480" w:hanging="360"/>
+      </w:pPr>
+      <w:rPr>
+        <w:rFonts w:ascii="Wingdings" w:hAnsi="Wingdings" w:hint="default"/>
+        <w:sz w:val="20"/>
+      </w:rPr>
+    </w:lvl>
+  </w:abstractNum>
+  <w:num w:numId="1" w16cid:durableId="2012828241">
+    <w:abstractNumId w:val="3"/>
+  </w:num>
+  <w:num w:numId="2" w16cid:durableId="436605559">
+    <w:abstractNumId w:val="4"/>
+  </w:num>
+  <w:num w:numId="3" w16cid:durableId="1934624296">
+    <w:abstractNumId w:val="0"/>
+  </w:num>
+  <w:num w:numId="4" w16cid:durableId="1262881527">
+    <w:abstractNumId w:val="6"/>
+  </w:num>
+  <w:num w:numId="5" w16cid:durableId="42291424">
+    <w:abstractNumId w:val="5"/>
+  </w:num>
+  <w:num w:numId="6" w16cid:durableId="490799440">
+    <w:abstractNumId w:val="7"/>
+  </w:num>
+  <w:num w:numId="7" w16cid:durableId="1159418608">
+    <w:abstractNumId w:val="2"/>
+  </w:num>
+  <w:num w:numId="8" w16cid:durableId="1024282455">
+    <w:abstractNumId w:val="1"/>
+  </w:num>
+</w:numbering>
 </file>
 
 <file path=word/styles.xml><?xml version="1.0" encoding="utf-8"?>

</xml_diff>

<commit_message>
Updated to finish V4 log and V5 concept
</commit_message>
<xml_diff>
--- a/info galore.docx
+++ b/info galore.docx
@@ -34,18 +34,7 @@
     </w:p>
     <w:p>
       <w:r>
-        <w:t>4</w:t>
-      </w:r>
-      <w:r>
-        <w:t xml:space="preserve">. </w:t>
-      </w:r>
-      <w:proofErr w:type="spellStart"/>
-      <w:r>
-        <w:t>BrainGPT</w:t>
-      </w:r>
-      <w:proofErr w:type="spellEnd"/>
-      <w:r>
-        <w:t xml:space="preserve"> V1</w:t>
+        <w:t>4. My checklist of things to do and NOT to do (Ongoing)</w:t>
       </w:r>
     </w:p>
     <w:p>
@@ -61,7 +50,18 @@
       </w:r>
       <w:proofErr w:type="spellEnd"/>
       <w:r>
-        <w:t xml:space="preserve"> V2</w:t>
+        <w:t xml:space="preserve"> V1</w:t>
+      </w:r>
+      <w:r>
+        <w:t xml:space="preserve"> (</w:t>
+      </w:r>
+      <w:proofErr w:type="spellStart"/>
+      <w:r>
+        <w:t>BrainGPT</w:t>
+      </w:r>
+      <w:proofErr w:type="spellEnd"/>
+      <w:r>
+        <w:t>)</w:t>
       </w:r>
     </w:p>
     <w:p>
@@ -77,7 +77,10 @@
       </w:r>
       <w:proofErr w:type="spellEnd"/>
       <w:r>
-        <w:t xml:space="preserve"> V3</w:t>
+        <w:t xml:space="preserve"> V2</w:t>
+      </w:r>
+      <w:r>
+        <w:t xml:space="preserve"> (Markov)</w:t>
       </w:r>
     </w:p>
     <w:p>
@@ -93,7 +96,10 @@
       </w:r>
       <w:proofErr w:type="spellEnd"/>
       <w:r>
-        <w:t xml:space="preserve"> 3.5</w:t>
+        <w:t xml:space="preserve"> V3</w:t>
+      </w:r>
+      <w:r>
+        <w:t xml:space="preserve"> (Theat)</w:t>
       </w:r>
     </w:p>
     <w:p>
@@ -109,7 +115,42 @@
       </w:r>
       <w:proofErr w:type="spellEnd"/>
       <w:r>
-        <w:t xml:space="preserve"> 4 (Ongoing)</w:t>
+        <w:t xml:space="preserve"> 3.5</w:t>
+      </w:r>
+    </w:p>
+    <w:p>
+      <w:r>
+        <w:t>9</w:t>
+      </w:r>
+      <w:r>
+        <w:t xml:space="preserve">. </w:t>
+      </w:r>
+      <w:proofErr w:type="spellStart"/>
+      <w:r>
+        <w:t>BrainGPT</w:t>
+      </w:r>
+      <w:proofErr w:type="spellEnd"/>
+      <w:r>
+        <w:t xml:space="preserve"> 4</w:t>
+      </w:r>
+      <w:r>
+        <w:t xml:space="preserve"> (Matrix)</w:t>
+      </w:r>
+    </w:p>
+    <w:p>
+      <w:r>
+        <w:t xml:space="preserve">10. </w:t>
+      </w:r>
+      <w:proofErr w:type="spellStart"/>
+      <w:r>
+        <w:t>BrainGPT</w:t>
+      </w:r>
+      <w:proofErr w:type="spellEnd"/>
+      <w:r>
+        <w:t xml:space="preserve"> 5</w:t>
+      </w:r>
+      <w:r>
+        <w:t xml:space="preserve"> (Ribbon)</w:t>
       </w:r>
     </w:p>
     <w:p>
@@ -515,6 +556,17 @@
       <w:r>
         <w:t>it fails too)</w:t>
       </w:r>
+      <w:r>
+        <w:t xml:space="preserve"> (</w:t>
+      </w:r>
+      <w:proofErr w:type="gramStart"/>
+      <w:r>
+        <w:t>Yeah</w:t>
+      </w:r>
+      <w:proofErr w:type="gramEnd"/>
+      <w:r>
+        <w:t xml:space="preserve"> it did but not for the right reasons)</w:t>
+      </w:r>
     </w:p>
     <w:p>
       <w:pPr>
@@ -523,133 +575,164 @@
       <w:r>
         <w:t>BrainGPTV4:</w:t>
       </w:r>
-      <w:r>
-        <w:t xml:space="preserve"> (Currently in progress)</w:t>
-      </w:r>
     </w:p>
     <w:p>
       <w:r>
-        <w:t>Timeline of what was learnt:</w:t>
-      </w:r>
-      <w:r>
-        <w:br/>
-        <w:t>When using dummy values:</w:t>
+        <w:t>Update log is removed to add this sort of paragraph.</w:t>
       </w:r>
     </w:p>
     <w:p>
-      <w:r>
-        <w:t>Crossing signals was possible as well as a simple learning rule that updated. At that stage it w</w:t>
-      </w:r>
-      <w:r>
-        <w:t>as nothing more than a concept test</w:t>
+      <w:proofErr w:type="gramStart"/>
+      <w:r>
+        <w:t>Firstly</w:t>
+      </w:r>
+      <w:proofErr w:type="gramEnd"/>
+      <w:r>
+        <w:t xml:space="preserve"> this new (</w:t>
+      </w:r>
+      <w:proofErr w:type="spellStart"/>
+      <w:r>
+        <w:t>ish</w:t>
+      </w:r>
+      <w:proofErr w:type="spellEnd"/>
+      <w:r>
+        <w:t xml:space="preserve">) version used matrixes instead of my earlier custom implementation. The fundamental way the most recent version worked (Ver 4.2, for earlier versions check the </w:t>
+      </w:r>
+      <w:proofErr w:type="spellStart"/>
+      <w:r>
+        <w:t>github</w:t>
+      </w:r>
+      <w:proofErr w:type="spellEnd"/>
+      <w:r>
+        <w:t xml:space="preserve"> repo) was entering the context into a QKV attention system. Then it would scan a line in the radius which was set. This would make a new position for the next line and scan again, rinse and repeat until you ended up with a final coordinate which corresponds to a moveable token embedding. All this (except for the attention) is the same ideals as Ver 3 HOWEVER there is a critical issue with this system. Because </w:t>
+      </w:r>
+      <w:proofErr w:type="spellStart"/>
+      <w:r>
+        <w:t>backpropogation</w:t>
+      </w:r>
+      <w:proofErr w:type="spellEnd"/>
+      <w:r>
+        <w:t xml:space="preserve"> is literally IMPOSSIBLE (due to the shifts in any layer making it scan different weights) the token embeddings move as well as the weights. Meaning that it’s a chicken and egg problem where the embedding chases the end position and the end chases the embedding. Even with using a linear probability distribution based on distance, the embedding still moves even if </w:t>
+      </w:r>
+      <w:proofErr w:type="spellStart"/>
+      <w:proofErr w:type="gramStart"/>
+      <w:r>
+        <w:t>its</w:t>
+      </w:r>
+      <w:proofErr w:type="spellEnd"/>
+      <w:proofErr w:type="gramEnd"/>
+      <w:r>
+        <w:t xml:space="preserve"> not the cause of the error. The way transformers fix this is with </w:t>
+      </w:r>
+      <w:proofErr w:type="spellStart"/>
+      <w:r>
+        <w:t>backpropogation</w:t>
+      </w:r>
+      <w:proofErr w:type="spellEnd"/>
+      <w:r>
+        <w:t xml:space="preserve"> where blame is assigned to weights of </w:t>
+      </w:r>
+      <w:proofErr w:type="gramStart"/>
+      <w:r>
+        <w:t>embeddings</w:t>
+      </w:r>
+      <w:proofErr w:type="gramEnd"/>
+      <w:r>
+        <w:t xml:space="preserve"> so they move in a direction that decreases loss. As in if an embedding is already in a good place the gradient is near 0 however if the weights are wrong then their gradient is high to correct them. So backprop is impossible but it also needs backprop to work. </w:t>
+      </w:r>
+      <w:proofErr w:type="gramStart"/>
+      <w:r>
+        <w:t>However</w:t>
+      </w:r>
+      <w:proofErr w:type="gramEnd"/>
+      <w:r>
+        <w:t xml:space="preserve"> I have an idea for </w:t>
+      </w:r>
+      <w:proofErr w:type="spellStart"/>
+      <w:r>
+        <w:t>BrainGPT</w:t>
+      </w:r>
+      <w:proofErr w:type="spellEnd"/>
+      <w:r>
+        <w:t xml:space="preserve"> V5</w:t>
       </w:r>
     </w:p>
     <w:p>
-      <w:r>
-        <w:t xml:space="preserve">At </w:t>
-      </w:r>
-      <w:r>
-        <w:t>the stage of testing single token generation. Input and output grids were needed to allocate starting positions as well as the strength of the signal which the sparse grid allocated to token positions. This was when the first discovery of attention was made.</w:t>
+      <w:pPr>
+        <w:pStyle w:val="Heading1"/>
+      </w:pPr>
+      <w:proofErr w:type="spellStart"/>
+      <w:r>
+        <w:t>BrainGPT</w:t>
+      </w:r>
+      <w:proofErr w:type="spellEnd"/>
+      <w:r>
+        <w:t xml:space="preserve"> V5 (Ongoing):</w:t>
       </w:r>
     </w:p>
     <w:p>
       <w:r>
-        <w:t>(Current stage multi token)</w:t>
+        <w:t>Basic idea:</w:t>
       </w:r>
     </w:p>
     <w:p>
       <w:r>
-        <w:t xml:space="preserve">This has been the most informative so far. The grids had to accept multiple inputs from context as well as making a new dense layer which turns output of sparse grid into actual tokens. And for this to work. A form of QKV was invented. Query and Keys being the input grids and Value being the answer that was returned. </w:t>
-      </w:r>
-      <w:r>
-        <w:t>Also,</w:t>
-      </w:r>
-      <w:r>
-        <w:t xml:space="preserve"> now training </w:t>
-      </w:r>
-      <w:r>
-        <w:t>must</w:t>
-      </w:r>
-      <w:r>
-        <w:t xml:space="preserve"> be done using proper backprop (so that the 256 current input dims aren’t all just the same number). Also adding probability distribution and the ability to change token embedding positions allows actual cross entropy loss. So </w:t>
-      </w:r>
-      <w:r>
-        <w:t>far,</w:t>
-      </w:r>
-      <w:r>
-        <w:t xml:space="preserve"> </w:t>
-      </w:r>
-      <w:r>
-        <w:t>it’s</w:t>
-      </w:r>
-      <w:r>
-        <w:t xml:space="preserve"> been reinventing the wheel through debugging and improvements.</w:t>
-      </w:r>
-    </w:p>
-    <w:p>
-      <w:r>
-        <w:t xml:space="preserve">After trying to experiment with dense grids I found that its </w:t>
-      </w:r>
-      <w:r>
-        <w:t>fundamentally</w:t>
-      </w:r>
-      <w:r>
-        <w:t xml:space="preserve"> mismatched </w:t>
-      </w:r>
-      <w:r>
-        <w:t xml:space="preserve">dimension wise, </w:t>
-      </w:r>
-      <w:r>
-        <w:t xml:space="preserve">so I need a better system. As in it outputs </w:t>
-      </w:r>
-      <w:r>
-        <w:t>an</w:t>
-      </w:r>
-      <w:r>
-        <w:t xml:space="preserve"> array of numbers but I need single coordinates/positions</w:t>
-      </w:r>
-      <w:r>
-        <w:t xml:space="preserve"> and compressing them ruins it. </w:t>
-      </w:r>
-      <w:r>
-        <w:t>So,</w:t>
-      </w:r>
-      <w:r>
-        <w:t xml:space="preserve"> </w:t>
-      </w:r>
-      <w:r>
-        <w:t>I’ve</w:t>
-      </w:r>
-      <w:r>
-        <w:t xml:space="preserve"> gone with a better approach </w:t>
-      </w:r>
-      <w:r>
-        <w:t>where the token embeddings are learnt</w:t>
-      </w:r>
-      <w:r>
-        <w:t xml:space="preserve"> like </w:t>
-      </w:r>
-      <w:r>
-        <w:t>normal,</w:t>
-      </w:r>
-      <w:r>
-        <w:t xml:space="preserve"> but they are just coordinates limited to the start and end of the grid</w:t>
-      </w:r>
-    </w:p>
-    <w:p>
-      <w:r>
-        <w:t>After some more testing I realised that a better form of attention is needed than the sum and averaging of previous token route answers, currently finding a form of functioning attention is still in progress</w:t>
-      </w:r>
-    </w:p>
-    <w:p>
-      <w:r>
-        <w:t>Project was reverted to the state of single token generation, as the newer versions have stacked on layers that do not help the system and make debugging harder.</w:t>
-      </w:r>
-    </w:p>
-    <w:p>
+        <w:t xml:space="preserve">Don’t </w:t>
+      </w:r>
+      <w:r>
+        <w:t xml:space="preserve">just change the weights, change where they are. Make long strips of numbers (how many is up to variable) that change position as well as changing the weights to change how it bends. These strips inhabit the same space so if one starts to overlap with another, it adds them together. Opposing directions cancel out while same directions boost. Each strip of weight has the same influence on the walk. The secret sauce is that the scanned weights DON’T CHANGE, </w:t>
+      </w:r>
+      <w:proofErr w:type="spellStart"/>
+      <w:proofErr w:type="gramStart"/>
+      <w:r>
+        <w:t>its</w:t>
+      </w:r>
+      <w:proofErr w:type="spellEnd"/>
+      <w:proofErr w:type="gramEnd"/>
+      <w:r>
+        <w:t xml:space="preserve"> just what they mesh with </w:t>
+      </w:r>
+      <w:proofErr w:type="gramStart"/>
+      <w:r>
+        <w:t>that changes</w:t>
+      </w:r>
+      <w:proofErr w:type="gramEnd"/>
+      <w:r>
+        <w:t xml:space="preserve">. </w:t>
+      </w:r>
+      <w:proofErr w:type="gramStart"/>
+      <w:r>
+        <w:t>So</w:t>
+      </w:r>
+      <w:proofErr w:type="gramEnd"/>
+      <w:r>
+        <w:t xml:space="preserve"> we know what weights are scanned and their influence and a small change of weight </w:t>
+      </w:r>
+      <w:r>
+        <w:t xml:space="preserve">makes a small change in the answer. The only issue I see so far is that the </w:t>
+      </w:r>
       <w:r>
         <w:lastRenderedPageBreak/>
-        <w:t xml:space="preserve">New ideas introduced. Re-adding and reworking the QKV idea but this time done right as previously it was done wrong where all 256 dims (testing number) was all the same because they all were multiplied the same, however this rework will increase the dimensions of the model itself by storing a 1D list of numbers for each dimension to avoid “The curse of dimensionality” as Llama does. This gives it a larger representational capacity without blowing up storage requirements. Actual backprop will (probably) be added if I get around to it. After it works (Or if it does) </w:t>
+        <w:t xml:space="preserve">starting position just snaps to the nearest strip of weights so that might be an </w:t>
+      </w:r>
+      <w:proofErr w:type="gramStart"/>
+      <w:r>
+        <w:t>issue</w:t>
+      </w:r>
+      <w:proofErr w:type="gramEnd"/>
+      <w:r>
+        <w:t xml:space="preserve"> but we cross that bridge when we get there</w:t>
+      </w:r>
+      <w:r>
+        <w:t xml:space="preserve">. </w:t>
+      </w:r>
+      <w:proofErr w:type="gramStart"/>
+      <w:r>
+        <w:t>Also</w:t>
+      </w:r>
+      <w:proofErr w:type="gramEnd"/>
+      <w:r>
+        <w:t xml:space="preserve"> I think </w:t>
       </w:r>
       <w:proofErr w:type="spellStart"/>
       <w:r>
@@ -657,815 +740,7 @@
       </w:r>
       <w:proofErr w:type="spellEnd"/>
       <w:r>
-        <w:t xml:space="preserve"> going to start learning C++ so that I can optimize it to run fast </w:t>
-      </w:r>
-      <w:r>
-        <w:t>and the ideas of manually fetching cache will be quite beneficial due to its irregular access patterns + faster math</w:t>
-      </w:r>
-    </w:p>
-    <w:p>
-      <w:pPr>
-        <w:rPr>
-          <w:b/>
-          <w:bCs/>
-        </w:rPr>
-      </w:pPr>
-      <w:r>
-        <w:t>Checklist (</w:t>
-      </w:r>
-      <w:proofErr w:type="gramStart"/>
-      <w:r>
-        <w:t>Yes</w:t>
-      </w:r>
-      <w:proofErr w:type="gramEnd"/>
-      <w:r>
-        <w:t xml:space="preserve"> it was created by </w:t>
-      </w:r>
-      <w:proofErr w:type="spellStart"/>
-      <w:r>
-        <w:t>claude</w:t>
-      </w:r>
-      <w:proofErr w:type="spellEnd"/>
-      <w:r>
-        <w:t xml:space="preserve"> </w:t>
-      </w:r>
-      <w:proofErr w:type="spellStart"/>
-      <w:r>
-        <w:t>bcus</w:t>
-      </w:r>
-      <w:proofErr w:type="spellEnd"/>
-      <w:r>
-        <w:t xml:space="preserve"> </w:t>
-      </w:r>
-      <w:proofErr w:type="spellStart"/>
-      <w:r>
-        <w:t>im</w:t>
-      </w:r>
-      <w:proofErr w:type="spellEnd"/>
-      <w:r>
-        <w:t xml:space="preserve"> too lazy to do formatting and whatnot)</w:t>
-      </w:r>
-      <w:r>
-        <w:br/>
-      </w:r>
-      <w:r>
-        <w:rPr>
-          <w:b/>
-          <w:bCs/>
-        </w:rPr>
-        <w:t>1. Token embeddings (new data structure)</w:t>
-      </w:r>
-    </w:p>
-    <w:p>
-      <w:pPr>
-        <w:numPr>
-          <w:ilvl w:val="0"/>
-          <w:numId w:val="1"/>
-        </w:numPr>
-      </w:pPr>
-      <w:r>
-        <w:t xml:space="preserve">Add an </w:t>
-      </w:r>
-      <w:r>
-        <w:rPr>
-          <w:b/>
-          <w:bCs/>
-        </w:rPr>
-        <w:t>embedding table</w:t>
-      </w:r>
-      <w:r>
-        <w:t>: shape (</w:t>
-      </w:r>
-      <w:proofErr w:type="spellStart"/>
-      <w:r>
-        <w:t>vocab_size</w:t>
-      </w:r>
-      <w:proofErr w:type="spellEnd"/>
-      <w:r>
-        <w:t>, d), one row of d learnable floats per token. Small d (start with 8–16), random init.</w:t>
-      </w:r>
-    </w:p>
-    <w:p>
-      <w:pPr>
-        <w:numPr>
-          <w:ilvl w:val="0"/>
-          <w:numId w:val="1"/>
-        </w:numPr>
-      </w:pPr>
-      <w:r>
-        <w:t xml:space="preserve">Separate from </w:t>
-      </w:r>
-      <w:proofErr w:type="spellStart"/>
-      <w:r>
-        <w:t>i_vecs</w:t>
-      </w:r>
-      <w:proofErr w:type="spellEnd"/>
-      <w:r>
-        <w:t>/</w:t>
-      </w:r>
-      <w:proofErr w:type="spellStart"/>
-      <w:r>
-        <w:t>o_vecs</w:t>
-      </w:r>
-      <w:proofErr w:type="spellEnd"/>
-      <w:r>
-        <w:t xml:space="preserve"> (which stay spatial: token → grid position). Embedding table holds </w:t>
-      </w:r>
-      <w:r>
-        <w:rPr>
-          <w:i/>
-          <w:iCs/>
-        </w:rPr>
-        <w:t>content</w:t>
-      </w:r>
-      <w:r>
-        <w:t xml:space="preserve"> vectors, not positions.</w:t>
-      </w:r>
-    </w:p>
-    <w:p>
-      <w:pPr>
-        <w:numPr>
-          <w:ilvl w:val="0"/>
-          <w:numId w:val="1"/>
-        </w:numPr>
-      </w:pPr>
-      <w:r>
-        <w:t>Static/context-free — always the same values for a given token before contextualization.</w:t>
-      </w:r>
-    </w:p>
-    <w:p>
-      <w:pPr>
-        <w:rPr>
-          <w:b/>
-          <w:bCs/>
-        </w:rPr>
-      </w:pPr>
-      <w:r>
-        <w:rPr>
-          <w:b/>
-          <w:bCs/>
-        </w:rPr>
-        <w:t>2. QKV projections (new parameters)</w:t>
-      </w:r>
-    </w:p>
-    <w:p>
-      <w:pPr>
-        <w:numPr>
-          <w:ilvl w:val="0"/>
-          <w:numId w:val="2"/>
-        </w:numPr>
-      </w:pPr>
-      <w:r>
-        <w:t xml:space="preserve">Three small dense matrices: </w:t>
-      </w:r>
-      <w:proofErr w:type="spellStart"/>
-      <w:r>
-        <w:t>W_q</w:t>
-      </w:r>
-      <w:proofErr w:type="spellEnd"/>
-      <w:r>
-        <w:t xml:space="preserve">, </w:t>
-      </w:r>
-      <w:proofErr w:type="spellStart"/>
-      <w:r>
-        <w:t>W_k</w:t>
-      </w:r>
-      <w:proofErr w:type="spellEnd"/>
-      <w:r>
-        <w:t xml:space="preserve">, </w:t>
-      </w:r>
-      <w:proofErr w:type="spellStart"/>
-      <w:r>
-        <w:t>W_v</w:t>
-      </w:r>
-      <w:proofErr w:type="spellEnd"/>
-      <w:r>
-        <w:t xml:space="preserve">, each roughly </w:t>
-      </w:r>
-      <w:proofErr w:type="spellStart"/>
-      <w:r>
-        <w:t>d_k</w:t>
-      </w:r>
-      <w:proofErr w:type="spellEnd"/>
-      <w:r>
-        <w:t xml:space="preserve"> × d (or </w:t>
-      </w:r>
-      <w:proofErr w:type="spellStart"/>
-      <w:r>
-        <w:t>d_v</w:t>
-      </w:r>
-      <w:proofErr w:type="spellEnd"/>
-      <w:r>
-        <w:t xml:space="preserve"> × d for </w:t>
-      </w:r>
-      <w:proofErr w:type="spellStart"/>
-      <w:r>
-        <w:t>W_v</w:t>
-      </w:r>
-      <w:proofErr w:type="spellEnd"/>
-      <w:r>
-        <w:t>). Fixed size, independent of grid size — not part of the sparse grid at all.</w:t>
-      </w:r>
-    </w:p>
-    <w:p>
-      <w:pPr>
-        <w:numPr>
-          <w:ilvl w:val="0"/>
-          <w:numId w:val="2"/>
-        </w:numPr>
-      </w:pPr>
-      <w:r>
-        <w:t xml:space="preserve">Q = </w:t>
-      </w:r>
-      <w:proofErr w:type="spellStart"/>
-      <w:r>
-        <w:t>W_q</w:t>
-      </w:r>
-      <w:proofErr w:type="spellEnd"/>
-      <w:r>
-        <w:t xml:space="preserve"> @ </w:t>
-      </w:r>
-      <w:proofErr w:type="spellStart"/>
-      <w:r>
-        <w:t>current_state_vec</w:t>
-      </w:r>
-      <w:proofErr w:type="spellEnd"/>
-    </w:p>
-    <w:p>
-      <w:pPr>
-        <w:numPr>
-          <w:ilvl w:val="0"/>
-          <w:numId w:val="2"/>
-        </w:numPr>
-      </w:pPr>
-      <w:proofErr w:type="spellStart"/>
-      <w:r>
-        <w:t>K_i</w:t>
-      </w:r>
-      <w:proofErr w:type="spellEnd"/>
-      <w:r>
-        <w:t xml:space="preserve"> = </w:t>
-      </w:r>
-      <w:proofErr w:type="spellStart"/>
-      <w:r>
-        <w:t>W_k</w:t>
-      </w:r>
-      <w:proofErr w:type="spellEnd"/>
-      <w:r>
-        <w:t xml:space="preserve"> @ </w:t>
-      </w:r>
-      <w:proofErr w:type="spellStart"/>
-      <w:r>
-        <w:t>token_i_vec</w:t>
-      </w:r>
-      <w:proofErr w:type="spellEnd"/>
-      <w:r>
-        <w:t xml:space="preserve"> (for each context token)</w:t>
-      </w:r>
-    </w:p>
-    <w:p>
-      <w:pPr>
-        <w:numPr>
-          <w:ilvl w:val="0"/>
-          <w:numId w:val="2"/>
-        </w:numPr>
-      </w:pPr>
-      <w:proofErr w:type="spellStart"/>
-      <w:r>
-        <w:t>V_i</w:t>
-      </w:r>
-      <w:proofErr w:type="spellEnd"/>
-      <w:r>
-        <w:t xml:space="preserve"> = </w:t>
-      </w:r>
-      <w:proofErr w:type="spellStart"/>
-      <w:r>
-        <w:t>W_v</w:t>
-      </w:r>
-      <w:proofErr w:type="spellEnd"/>
-      <w:r>
-        <w:t xml:space="preserve"> @ </w:t>
-      </w:r>
-      <w:proofErr w:type="spellStart"/>
-      <w:r>
-        <w:t>token_i_vec</w:t>
-      </w:r>
-      <w:proofErr w:type="spellEnd"/>
-    </w:p>
-    <w:p>
-      <w:pPr>
-        <w:rPr>
-          <w:b/>
-          <w:bCs/>
-        </w:rPr>
-      </w:pPr>
-      <w:r>
-        <w:rPr>
-          <w:b/>
-          <w:bCs/>
-        </w:rPr>
-        <w:t>3. Content-dependent magnitude (relevance score)</w:t>
-      </w:r>
-    </w:p>
-    <w:p>
-      <w:pPr>
-        <w:numPr>
-          <w:ilvl w:val="0"/>
-          <w:numId w:val="3"/>
-        </w:numPr>
-      </w:pPr>
-      <w:proofErr w:type="spellStart"/>
-      <w:r>
-        <w:t>score_i</w:t>
-      </w:r>
-      <w:proofErr w:type="spellEnd"/>
-      <w:r>
-        <w:t xml:space="preserve"> = Q · </w:t>
-      </w:r>
-      <w:proofErr w:type="spellStart"/>
-      <w:r>
-        <w:t>K_i</w:t>
-      </w:r>
-      <w:proofErr w:type="spellEnd"/>
-      <w:r>
-        <w:t xml:space="preserve"> — replaces the fixed /2 blend ratio.</w:t>
-      </w:r>
-    </w:p>
-    <w:p>
-      <w:pPr>
-        <w:numPr>
-          <w:ilvl w:val="0"/>
-          <w:numId w:val="3"/>
-        </w:numPr>
-      </w:pPr>
-      <w:r>
-        <w:t xml:space="preserve">Because embeddings are vectors (not scalars), this dot product </w:t>
-      </w:r>
-      <w:proofErr w:type="gramStart"/>
-      <w:r>
-        <w:t>actually varies</w:t>
-      </w:r>
-      <w:proofErr w:type="gramEnd"/>
-      <w:r>
-        <w:t xml:space="preserve"> with content instead of collapsing to one number for everyone.</w:t>
-      </w:r>
-    </w:p>
-    <w:p>
-      <w:pPr>
-        <w:numPr>
-          <w:ilvl w:val="0"/>
-          <w:numId w:val="3"/>
-        </w:numPr>
-      </w:pPr>
-      <w:r>
-        <w:t>This is "how much does this context token matter right now."</w:t>
-      </w:r>
-    </w:p>
-    <w:p>
-      <w:pPr>
-        <w:rPr>
-          <w:b/>
-          <w:bCs/>
-        </w:rPr>
-      </w:pPr>
-      <w:r>
-        <w:rPr>
-          <w:b/>
-          <w:bCs/>
-        </w:rPr>
-        <w:t xml:space="preserve">4. Contextualized embeddings ("movable" embeddings — disambiguation, e.g. </w:t>
-      </w:r>
-      <w:proofErr w:type="gramStart"/>
-      <w:r>
-        <w:rPr>
-          <w:b/>
-          <w:bCs/>
-        </w:rPr>
-        <w:t>river bank</w:t>
-      </w:r>
-      <w:proofErr w:type="gramEnd"/>
-      <w:r>
-        <w:rPr>
-          <w:b/>
-          <w:bCs/>
-        </w:rPr>
-        <w:t xml:space="preserve"> vs. financial bank)</w:t>
-      </w:r>
-    </w:p>
-    <w:p>
-      <w:pPr>
-        <w:numPr>
-          <w:ilvl w:val="0"/>
-          <w:numId w:val="4"/>
-        </w:numPr>
-      </w:pPr>
-      <w:proofErr w:type="spellStart"/>
-      <w:r>
-        <w:t>effective_vec</w:t>
-      </w:r>
-      <w:proofErr w:type="spellEnd"/>
-      <w:r>
-        <w:t xml:space="preserve">(token) = </w:t>
-      </w:r>
-      <w:proofErr w:type="spellStart"/>
-      <w:r>
-        <w:t>weighted_sum_over_</w:t>
-      </w:r>
-      <w:proofErr w:type="gramStart"/>
-      <w:r>
-        <w:t>context</w:t>
-      </w:r>
-      <w:proofErr w:type="spellEnd"/>
-      <w:r>
-        <w:t>(</w:t>
-      </w:r>
-      <w:proofErr w:type="spellStart"/>
-      <w:proofErr w:type="gramEnd"/>
-      <w:r>
-        <w:t>V_i</w:t>
-      </w:r>
-      <w:proofErr w:type="spellEnd"/>
-      <w:r>
-        <w:t>, weight=</w:t>
-      </w:r>
-      <w:proofErr w:type="spellStart"/>
-      <w:r>
-        <w:t>score_i</w:t>
-      </w:r>
-      <w:proofErr w:type="spellEnd"/>
-      <w:r>
-        <w:t>)</w:t>
-      </w:r>
-    </w:p>
-    <w:p>
-      <w:pPr>
-        <w:numPr>
-          <w:ilvl w:val="0"/>
-          <w:numId w:val="4"/>
-        </w:numPr>
-      </w:pPr>
-      <w:r>
-        <w:lastRenderedPageBreak/>
-        <w:t>Static embedding never changes; this weighted blend is recomputed fresh every time the token appears, pulled toward whichever context tokens score as relevant.</w:t>
-      </w:r>
-    </w:p>
-    <w:p>
-      <w:pPr>
-        <w:numPr>
-          <w:ilvl w:val="0"/>
-          <w:numId w:val="4"/>
-        </w:numPr>
-      </w:pPr>
-      <w:r>
-        <w:t>This blended vector — not the raw static embedding — feeds into the rest of the walker step.</w:t>
-      </w:r>
-    </w:p>
-    <w:p>
-      <w:pPr>
-        <w:numPr>
-          <w:ilvl w:val="0"/>
-          <w:numId w:val="4"/>
-        </w:numPr>
-      </w:pPr>
-      <w:r>
-        <w:t xml:space="preserve">Cheaper alternative if full </w:t>
-      </w:r>
-      <w:proofErr w:type="gramStart"/>
-      <w:r>
-        <w:t>weighted-sum</w:t>
-      </w:r>
-      <w:proofErr w:type="gramEnd"/>
-      <w:r>
-        <w:t xml:space="preserve"> is too much: additive offset version, </w:t>
-      </w:r>
-      <w:proofErr w:type="spellStart"/>
-      <w:r>
-        <w:t>effective_vec</w:t>
-      </w:r>
-      <w:proofErr w:type="spellEnd"/>
-      <w:r>
-        <w:t xml:space="preserve"> = </w:t>
-      </w:r>
-      <w:proofErr w:type="spellStart"/>
-      <w:r>
-        <w:t>base_vec</w:t>
-      </w:r>
-      <w:proofErr w:type="spellEnd"/>
-      <w:r>
-        <w:t xml:space="preserve"> + f(context).</w:t>
-      </w:r>
-    </w:p>
-    <w:p>
-      <w:pPr>
-        <w:rPr>
-          <w:b/>
-          <w:bCs/>
-        </w:rPr>
-      </w:pPr>
-      <w:r>
-        <w:rPr>
-          <w:b/>
-          <w:bCs/>
-        </w:rPr>
-        <w:t>5. Content-dependent direction (novel — not standard attention)</w:t>
-      </w:r>
-    </w:p>
-    <w:p>
-      <w:pPr>
-        <w:numPr>
-          <w:ilvl w:val="0"/>
-          <w:numId w:val="5"/>
-        </w:numPr>
-      </w:pPr>
-      <w:r>
-        <w:t xml:space="preserve">Separate from magnitude/relevance. A second output of the context computation: something like an angle or 2D unit vector that steers </w:t>
-      </w:r>
-      <w:r>
-        <w:rPr>
-          <w:i/>
-          <w:iCs/>
-        </w:rPr>
-        <w:t>which way</w:t>
-      </w:r>
-      <w:r>
-        <w:t xml:space="preserve"> the walker moves next, not just how far.</w:t>
-      </w:r>
-    </w:p>
-    <w:p>
-      <w:pPr>
-        <w:numPr>
-          <w:ilvl w:val="0"/>
-          <w:numId w:val="5"/>
-        </w:numPr>
-      </w:pPr>
-      <w:r>
-        <w:t xml:space="preserve">Should likely be a function of </w:t>
-      </w:r>
-      <w:r>
-        <w:rPr>
-          <w:i/>
-          <w:iCs/>
-        </w:rPr>
-        <w:t>(current state, context)</w:t>
-      </w:r>
-      <w:r>
-        <w:t xml:space="preserve"> jointly, not context alone, so the walker retains its own dynamics rather than being purely reactive.</w:t>
-      </w:r>
-    </w:p>
-    <w:p>
-      <w:pPr>
-        <w:numPr>
-          <w:ilvl w:val="0"/>
-          <w:numId w:val="5"/>
-        </w:numPr>
-      </w:pPr>
-      <w:r>
-        <w:t>Needs its own projection/output, distinct from the magnitude score in point 3.</w:t>
-      </w:r>
-    </w:p>
-    <w:p>
-      <w:pPr>
-        <w:rPr>
-          <w:b/>
-          <w:bCs/>
-        </w:rPr>
-      </w:pPr>
-      <w:r>
-        <w:rPr>
-          <w:b/>
-          <w:bCs/>
-        </w:rPr>
-        <w:t>6. Differentiable grid read (required for backprop through the walk)</w:t>
-      </w:r>
-    </w:p>
-    <w:p>
-      <w:pPr>
-        <w:numPr>
-          <w:ilvl w:val="0"/>
-          <w:numId w:val="6"/>
-        </w:numPr>
-      </w:pPr>
-      <w:r>
-        <w:t>Hard integer indexing (</w:t>
-      </w:r>
-      <w:proofErr w:type="gramStart"/>
-      <w:r>
-        <w:t>grid[</w:t>
-      </w:r>
-      <w:proofErr w:type="gramEnd"/>
-      <w:r>
-        <w:t xml:space="preserve">row, col]) has no gradient. Needs </w:t>
-      </w:r>
-      <w:r>
-        <w:rPr>
-          <w:b/>
-          <w:bCs/>
-        </w:rPr>
-        <w:t>bilinear interpolation</w:t>
-      </w:r>
-      <w:r>
-        <w:t>: read as a weighted blend of the 4 nearest integer grid cells based on fractional walk position.</w:t>
-      </w:r>
-    </w:p>
-    <w:p>
-      <w:pPr>
-        <w:numPr>
-          <w:ilvl w:val="0"/>
-          <w:numId w:val="6"/>
-        </w:numPr>
-      </w:pPr>
-      <w:r>
-        <w:t>This is the foundation everything else sits on — implement and gradient-check (finite differences vs. analytic) in isolation first.</w:t>
-      </w:r>
-    </w:p>
-    <w:p>
-      <w:pPr>
-        <w:rPr>
-          <w:b/>
-          <w:bCs/>
-        </w:rPr>
-      </w:pPr>
-      <w:r>
-        <w:rPr>
-          <w:b/>
-          <w:bCs/>
-        </w:rPr>
-        <w:t>7. Backprop (manual, NumPy)</w:t>
-      </w:r>
-    </w:p>
-    <w:p>
-      <w:pPr>
-        <w:numPr>
-          <w:ilvl w:val="0"/>
-          <w:numId w:val="7"/>
-        </w:numPr>
-      </w:pPr>
-      <w:r>
-        <w:t xml:space="preserve">No </w:t>
-      </w:r>
-      <w:proofErr w:type="spellStart"/>
-      <w:r>
-        <w:t>autodiff</w:t>
-      </w:r>
-      <w:proofErr w:type="spellEnd"/>
-      <w:r>
-        <w:t xml:space="preserve"> — write paired forward/backward functions for each op (</w:t>
-      </w:r>
-      <w:proofErr w:type="spellStart"/>
-      <w:r>
-        <w:t>matmul</w:t>
-      </w:r>
-      <w:proofErr w:type="spellEnd"/>
-      <w:r>
-        <w:t>, dot product, interpolation, nonlinearities).</w:t>
-      </w:r>
-    </w:p>
-    <w:p>
-      <w:pPr>
-        <w:numPr>
-          <w:ilvl w:val="0"/>
-          <w:numId w:val="7"/>
-        </w:numPr>
-      </w:pPr>
-      <w:r>
-        <w:t>Gradient-check each new op individually before combining.</w:t>
-      </w:r>
-    </w:p>
-    <w:p>
-      <w:pPr>
-        <w:rPr>
-          <w:b/>
-          <w:bCs/>
-        </w:rPr>
-      </w:pPr>
-      <w:r>
-        <w:rPr>
-          <w:b/>
-          <w:bCs/>
-        </w:rPr>
-        <w:t>Suggested build order</w:t>
-      </w:r>
-    </w:p>
-    <w:p>
-      <w:pPr>
-        <w:numPr>
-          <w:ilvl w:val="0"/>
-          <w:numId w:val="8"/>
-        </w:numPr>
-      </w:pPr>
-      <w:r>
-        <w:t>Bilinear differentiable grid read → gradient-check in isolation.</w:t>
-      </w:r>
-    </w:p>
-    <w:p>
-      <w:pPr>
-        <w:numPr>
-          <w:ilvl w:val="0"/>
-          <w:numId w:val="8"/>
-        </w:numPr>
-      </w:pPr>
-      <w:r>
-        <w:t>Wire into a trivial one-step walk + scalar loss, confirm gradients flow.</w:t>
-      </w:r>
-    </w:p>
-    <w:p>
-      <w:pPr>
-        <w:numPr>
-          <w:ilvl w:val="0"/>
-          <w:numId w:val="8"/>
-        </w:numPr>
-      </w:pPr>
-      <w:r>
-        <w:t xml:space="preserve">Add embedding table + </w:t>
-      </w:r>
-      <w:proofErr w:type="spellStart"/>
-      <w:r>
-        <w:t>W_q</w:t>
-      </w:r>
-      <w:proofErr w:type="spellEnd"/>
-      <w:r>
-        <w:t>/</w:t>
-      </w:r>
-      <w:proofErr w:type="spellStart"/>
-      <w:r>
-        <w:t>W_k</w:t>
-      </w:r>
-      <w:proofErr w:type="spellEnd"/>
-      <w:r>
-        <w:t>/</w:t>
-      </w:r>
-      <w:proofErr w:type="spellStart"/>
-      <w:r>
-        <w:t>W_v</w:t>
-      </w:r>
-      <w:proofErr w:type="spellEnd"/>
-      <w:r>
-        <w:t>, magnitude score → gradient-check.</w:t>
-      </w:r>
-    </w:p>
-    <w:p>
-      <w:pPr>
-        <w:numPr>
-          <w:ilvl w:val="0"/>
-          <w:numId w:val="8"/>
-        </w:numPr>
-      </w:pPr>
-      <w:r>
-        <w:t>Add contextualized/movable embeddings (weighted sum or additive offset) → gradient-check.</w:t>
-      </w:r>
-    </w:p>
-    <w:p>
-      <w:pPr>
-        <w:numPr>
-          <w:ilvl w:val="0"/>
-          <w:numId w:val="8"/>
-        </w:numPr>
-      </w:pPr>
-      <w:r>
-        <w:t>Add direction output → gradient-check.</w:t>
-      </w:r>
-    </w:p>
-    <w:p>
-      <w:pPr>
-        <w:numPr>
-          <w:ilvl w:val="0"/>
-          <w:numId w:val="8"/>
-        </w:numPr>
-      </w:pPr>
-      <w:r>
-        <w:t>Assemble full walker step, gradient-check end-to-end.</w:t>
-      </w:r>
-    </w:p>
-    <w:p>
-      <w:proofErr w:type="spellStart"/>
-      <w:r>
-        <w:lastRenderedPageBreak/>
-        <w:t>Attemped</w:t>
-      </w:r>
-      <w:proofErr w:type="spellEnd"/>
-      <w:r>
-        <w:t xml:space="preserve"> to add these but resulted in either very poor or </w:t>
-      </w:r>
-      <w:proofErr w:type="spellStart"/>
-      <w:r>
-        <w:t>nonexistant</w:t>
-      </w:r>
-      <w:proofErr w:type="spellEnd"/>
-      <w:r>
-        <w:t xml:space="preserve"> learning as well as exploding gradients and other bad issues on top of VERY poorly learning. Possibly time to mark V4.2 or the V4 series a failure. I think the issue is </w:t>
-      </w:r>
-      <w:proofErr w:type="gramStart"/>
-      <w:r>
-        <w:t>similar to</w:t>
-      </w:r>
-      <w:proofErr w:type="gramEnd"/>
-      <w:r>
-        <w:t xml:space="preserve"> algebra. When an equation has two variables such as x + y = 10 it becomes impossible to figure out the exact value of X. I suspect something similar is at play here.</w:t>
-      </w:r>
-    </w:p>
-    <w:p>
-      <w:r>
-        <w:t>V4 has been marked under failure for unknown reasons (For now)</w:t>
+        <w:t xml:space="preserve"> starting to start coding in C (Not to be confused with C++) and not python. Subject to change depending on how lazy I am.</w:t>
       </w:r>
     </w:p>
     <w:sectPr>

</xml_diff>